<commit_message>
artigo: restaura grifo amarelo da titulacao do orientador (rodape, omitido por engano) e pesquisa formacao
</commit_message>
<xml_diff>
--- a/Docs/Documentos_Entregaveis/Artigo/Artigo.docx
+++ b/Docs/Documentos_Entregaveis/Artigo/Artigo.docx
@@ -11811,7 +11811,37 @@
         <w:t xml:space="preserve"> </w:t>
       </w:r>
       <w:r>
-        <w:t xml:space="preserve">Orientador(a). Mestre em xxx pela xxx. E-</w:t>
+        <w:t xml:space="preserve">Orientador(a).</w:t>
+      </w:r>
+      <w:r>
+        <w:t xml:space="preserve"> </w:t>
+      </w:r>
+      <w:r>
+        <w:t xml:space="preserve">Mestre em xxx pela xxx – pendente de</w:t>
+      </w:r>
+      <w:r>
+        <w:t xml:space="preserve"> </w:t>
+      </w:r>
+      <w:r>
+        <w:t xml:space="preserve">verificação; busca em fontes institucionais não confirmou mestrado, ver</w:t>
+      </w:r>
+      <w:r>
+        <w:t xml:space="preserve"> </w:t>
+      </w:r>
+      <w:r>
+        <w:rPr>
+          <w:rStyle w:val="VerbatimChar"/>
+        </w:rPr>
+        <w:t xml:space="preserve">Melhoria_de_artigo.md</w:t>
+      </w:r>
+      <w:r>
+        <w:t xml:space="preserve">.</w:t>
+      </w:r>
+      <w:r>
+        <w:t xml:space="preserve"> </w:t>
+      </w:r>
+      <w:r>
+        <w:t xml:space="preserve">E-</w:t>
       </w:r>
       <w:r>
         <w:rPr>
@@ -11822,6 +11852,24 @@
       </w:r>
       <w:r>
         <w:t xml:space="preserve">: anker@ucl.br</w:t>
+      </w:r>
+      <w:r>
+        <w:t xml:space="preserve"> </w:t>
+      </w:r>
+      <w:r>
+        <w:t xml:space="preserve">(Professor especialista</w:t>
+      </w:r>
+      <w:r>
+        <w:t xml:space="preserve"> </w:t>
+      </w:r>
+      <w:r>
+        <w:t xml:space="preserve">– bacharel em Ciência da Computação pela UFES; pendente de confirmação em fonte</w:t>
+      </w:r>
+      <w:r>
+        <w:t xml:space="preserve"> </w:t>
+      </w:r>
+      <w:r>
+        <w:t xml:space="preserve">institucional)</w:t>
       </w:r>
     </w:p>
   </w:footnote>

</xml_diff>

<commit_message>
artigo: confirma titulacao do orientador (especialista, bacharel UFES) e remove grifo pendente
</commit_message>
<xml_diff>
--- a/Docs/Documentos_Entregaveis/Artigo/Artigo.docx
+++ b/Docs/Documentos_Entregaveis/Artigo/Artigo.docx
@@ -11811,37 +11811,13 @@
         <w:t xml:space="preserve"> </w:t>
       </w:r>
       <w:r>
-        <w:t xml:space="preserve">Orientador(a).</w:t>
-      </w:r>
-      <w:r>
-        <w:t xml:space="preserve"> </w:t>
-      </w:r>
-      <w:r>
-        <w:t xml:space="preserve">Mestre em xxx pela xxx – pendente de</w:t>
-      </w:r>
-      <w:r>
-        <w:t xml:space="preserve"> </w:t>
-      </w:r>
-      <w:r>
-        <w:t xml:space="preserve">verificação; busca em fontes institucionais não confirmou mestrado, ver</w:t>
-      </w:r>
-      <w:r>
-        <w:t xml:space="preserve"> </w:t>
-      </w:r>
-      <w:r>
-        <w:rPr>
-          <w:rStyle w:val="VerbatimChar"/>
-        </w:rPr>
-        <w:t xml:space="preserve">Melhoria_de_artigo.md</w:t>
-      </w:r>
-      <w:r>
-        <w:t xml:space="preserve">.</w:t>
-      </w:r>
-      <w:r>
-        <w:t xml:space="preserve"> </w:t>
-      </w:r>
-      <w:r>
-        <w:t xml:space="preserve">E-</w:t>
+        <w:t xml:space="preserve">Orientador(a). Professor especialista, bacharel em Ciência da</w:t>
+      </w:r>
+      <w:r>
+        <w:t xml:space="preserve"> </w:t>
+      </w:r>
+      <w:r>
+        <w:t xml:space="preserve">Computação pela Universidade Federal do Espírito Santo (UFES). E-</w:t>
       </w:r>
       <w:r>
         <w:rPr>
@@ -11852,24 +11828,6 @@
       </w:r>
       <w:r>
         <w:t xml:space="preserve">: anker@ucl.br</w:t>
-      </w:r>
-      <w:r>
-        <w:t xml:space="preserve"> </w:t>
-      </w:r>
-      <w:r>
-        <w:t xml:space="preserve">(Professor especialista</w:t>
-      </w:r>
-      <w:r>
-        <w:t xml:space="preserve"> </w:t>
-      </w:r>
-      <w:r>
-        <w:t xml:space="preserve">– bacharel em Ciência da Computação pela UFES; pendente de confirmação em fonte</w:t>
-      </w:r>
-      <w:r>
-        <w:t xml:space="preserve"> </w:t>
-      </w:r>
-      <w:r>
-        <w:t xml:space="preserve">institucional)</w:t>
       </w:r>
     </w:p>
   </w:footnote>

</xml_diff>

<commit_message>
artigo: condensa secoes de hiperparametros, impacto da 7a entrada e modelo de dados (30 -> 27 paginas)
</commit_message>
<xml_diff>
--- a/Docs/Documentos_Entregaveis/Artigo/Artigo.docx
+++ b/Docs/Documentos_Entregaveis/Artigo/Artigo.docx
@@ -4174,82 +4174,62 @@
         <w:pStyle w:val="FirstParagraph"/>
       </w:pPr>
       <w:r>
-        <w:t xml:space="preserve">A sétima entrada (tempo detectado sem abate) não fazia parte do projeto original – a rede nasceu</w:t>
-      </w:r>
-      <w:r>
-        <w:t xml:space="preserve"> </w:t>
-      </w:r>
-      <w:r>
-        <w:t xml:space="preserve">com seis entradas e cinco indicadores de contexto, e essa sétima foi incluída posteriormente para</w:t>
-      </w:r>
-      <w:r>
-        <w:t xml:space="preserve"> </w:t>
-      </w:r>
-      <w:r>
-        <w:t xml:space="preserve">dar à rede um sinal que faltava: por quanto tempo um alvo específico já vem sendo observado sem ter</w:t>
-      </w:r>
-      <w:r>
-        <w:t xml:space="preserve"> </w:t>
-      </w:r>
-      <w:r>
-        <w:t xml:space="preserve">sido abatido, de modo que a evolução pudesse aprender a priorizar alvos "esquecidos" em vez de</w:t>
-      </w:r>
-      <w:r>
-        <w:t xml:space="preserve"> </w:t>
-      </w:r>
-      <w:r>
-        <w:t xml:space="preserve">tratar todos como igualmente urgentes. Mudar a contagem de entradas de uma rede já evoluída, porém,</w:t>
-      </w:r>
-      <w:r>
-        <w:t xml:space="preserve"> </w:t>
-      </w:r>
-      <w:r>
-        <w:t xml:space="preserve">não é uma alteração isolada, e vale registrar os quatro impactos concretos que ela trouxe, cada um</w:t>
-      </w:r>
-      <w:r>
-        <w:t xml:space="preserve"> </w:t>
-      </w:r>
-      <w:r>
-        <w:t xml:space="preserve">observado diretamente neste trabalho e não apenas previsto em teoria.</w:t>
-      </w:r>
-    </w:p>
-    <w:p>
-      <w:pPr>
-        <w:pStyle w:val="BodyText"/>
-      </w:pPr>
-      <w:r>
-        <w:t xml:space="preserve">O primeiro impacto é no tamanho da rede: de 74 para 82 parâmetros (aumento de</w:t>
-      </w:r>
-      <w:r>
-        <w:t xml:space="preserve"> </w:t>
-      </w:r>
+        <w:t xml:space="preserve">A sétima entrada (tempo detectado sem abate) foi incluída depois do projeto original (seis</w:t>
+      </w:r>
+      <w:r>
+        <w:t xml:space="preserve"> </w:t>
+      </w:r>
+      <w:r>
+        <w:t xml:space="preserve">entradas) para dar à rede um sinal que faltava: por quanto tempo um alvo específico já vem sendo</w:t>
+      </w:r>
+      <w:r>
+        <w:t xml:space="preserve"> </w:t>
+      </w:r>
+      <w:r>
+        <w:t xml:space="preserve">observado sem ter sido abatido, para priorizar alvos "esquecidos" em vez de tratar todos como</w:t>
+      </w:r>
+      <w:r>
+        <w:t xml:space="preserve"> </w:t>
+      </w:r>
+      <w:r>
+        <w:t xml:space="preserve">igualmente urgentes. Mudar a contagem de entradas de uma rede já evoluída trouxe quatro impactos</w:t>
+      </w:r>
+      <w:r>
+        <w:t xml:space="preserve"> </w:t>
+      </w:r>
+      <w:r>
+        <w:t xml:space="preserve">concretos, observados diretamente neste trabalho:</w:t>
+      </w:r>
+    </w:p>
+    <w:p>
+      <w:pPr>
+        <w:pStyle w:val="FirstParagraph"/>
+        <w:numPr>
+          <w:ilvl w:val="0"/>
+          <w:numId w:val="1001"/>
+        </w:numPr>
+      </w:pPr>
       <w:r>
         <w:rPr>
           <w:b/>
           <w:bCs/>
         </w:rPr>
-        <w:t xml:space="preserve">8 pesos</w:t>
-      </w:r>
-      <w:r>
-        <w:t xml:space="preserve">, um</w:t>
-      </w:r>
-      <w:r>
-        <w:t xml:space="preserve"> </w:t>
-      </w:r>
-      <w:r>
-        <w:t xml:space="preserve">por neurônio da camada oculta, ligando a nova entrada a cada um deles – a camada oculta continuou</w:t>
-      </w:r>
-      <w:r>
-        <w:t xml:space="preserve"> </w:t>
-      </w:r>
-      <w:r>
-        <w:t xml:space="preserve">com 8 neurônios e as duas saídas não mudaram). É um acréscimo de 10,8% no genoma, mas, como a</w:t>
-      </w:r>
-      <w:r>
-        <w:t xml:space="preserve"> </w:t>
-      </w:r>
-      <w:r>
-        <w:t xml:space="preserve">Seção </w:t>
+        <w:t xml:space="preserve">Tamanho da rede</w:t>
+      </w:r>
+      <w:r>
+        <w:t xml:space="preserve">: de 74 para 82 parâmetros (+8 pesos, um por neurônio da camada</w:t>
+      </w:r>
+      <w:r>
+        <w:t xml:space="preserve"> </w:t>
+      </w:r>
+      <w:r>
+        <w:t xml:space="preserve">oculta) – 10,8% maior, mas imperceptível no tempo de treinamento, que continua dominado pelo</w:t>
+      </w:r>
+      <w:r>
+        <w:t xml:space="preserve"> </w:t>
+      </w:r>
+      <w:r>
+        <w:t xml:space="preserve">tamanho da população, não da rede (Seção </w:t>
       </w:r>
       <w:hyperlink w:anchor="_119a6bdc6d18c559c5be26f210764d7f901446e">
         <w:r>
@@ -4260,16 +4240,44 @@
         </w:r>
       </w:hyperlink>
       <w:r>
-        <w:t xml:space="preserve"> </w:t>
-      </w:r>
-      <w:r>
-        <w:t xml:space="preserve">confirma experimentalmente, o tempo de treinamento</w:t>
-      </w:r>
-      <w:r>
-        <w:t xml:space="preserve"> </w:t>
-      </w:r>
-      <w:r>
-        <w:t xml:space="preserve">continua dominado pela quantidade de episódios simulados por geração (função do tamanho da</w:t>
+        <w:t xml:space="preserve">).</w:t>
+      </w:r>
+    </w:p>
+    <w:p>
+      <w:pPr>
+        <w:pStyle w:val="FirstParagraph"/>
+        <w:numPr>
+          <w:ilvl w:val="0"/>
+          <w:numId w:val="1001"/>
+        </w:numPr>
+      </w:pPr>
+      <w:r>
+        <w:rPr>
+          <w:b/>
+          <w:bCs/>
+        </w:rPr>
+        <w:t xml:space="preserve">Incompatibilidade retroativa total</w:t>
+      </w:r>
+      <w:r>
+        <w:t xml:space="preserve">: um genoma de 74 pesos não pode ser usado por</w:t>
+      </w:r>
+      <w:r>
+        <w:t xml:space="preserve"> </w:t>
+      </w:r>
+      <w:r>
+        <w:t xml:space="preserve">uma rede que exige 82 – não há conversão nem "completar" o genoma antigo. Isso invalidou o</w:t>
+      </w:r>
+      <w:r>
+        <w:t xml:space="preserve"> </w:t>
+      </w:r>
+      <w:r>
+        <w:t xml:space="preserve">controlador de produção embutido e as 11 execuções da grade de hiperparâmetros, ambos</w:t>
+      </w:r>
+      <w:r>
+        <w:t xml:space="preserve"> </w:t>
+      </w:r>
+      <w:r>
+        <w:t xml:space="preserve">precisando ser retreinados do zero. Toda entrada nova é, na prática, um</w:t>
       </w:r>
       <w:r>
         <w:t xml:space="preserve"> </w:t>
@@ -4279,49 +4287,32 @@
           <w:i/>
           <w:iCs/>
         </w:rPr>
-        <w:t xml:space="preserve">população</w:t>
-      </w:r>
-      <w:r>
-        <w:t xml:space="preserve">), não pelo tamanho da rede avaliada em cada episódio – oito pesos adicionais são</w:t>
-      </w:r>
-      <w:r>
-        <w:t xml:space="preserve"> </w:t>
-      </w:r>
-      <w:r>
-        <w:t xml:space="preserve">imperceptíveis nesse custo, e nenhuma das onze execuções da grade mostrou um tempo de treinamento</w:t>
-      </w:r>
-      <w:r>
-        <w:t xml:space="preserve"> </w:t>
-      </w:r>
-      <w:r>
-        <w:t xml:space="preserve">mensuravelmente maior apenas por ter mais ocultos do que antes.</w:t>
-      </w:r>
-    </w:p>
-    <w:p>
-      <w:pPr>
-        <w:pStyle w:val="BodyText"/>
-      </w:pPr>
-      <w:r>
-        <w:t xml:space="preserve">O segundo impacto, esse sim severo, é a</w:t>
-      </w:r>
-      <w:r>
-        <w:t xml:space="preserve"> </w:t>
-      </w:r>
+        <w:t xml:space="preserve">breaking change</w:t>
+      </w:r>
+      <w:r>
+        <w:t xml:space="preserve"> </w:t>
+      </w:r>
+      <w:r>
+        <w:t xml:space="preserve">no formato do genoma.</w:t>
+      </w:r>
+    </w:p>
+    <w:p>
+      <w:pPr>
+        <w:pStyle w:val="FirstParagraph"/>
+        <w:numPr>
+          <w:ilvl w:val="0"/>
+          <w:numId w:val="1001"/>
+        </w:numPr>
+      </w:pPr>
       <w:r>
         <w:rPr>
           <w:b/>
           <w:bCs/>
         </w:rPr>
-        <w:t xml:space="preserve">incompatibilidade retroativa total</w:t>
-      </w:r>
-      <w:r>
-        <w:t xml:space="preserve">: qualquer genoma</w:t>
-      </w:r>
-      <w:r>
-        <w:t xml:space="preserve"> </w:t>
-      </w:r>
-      <w:r>
-        <w:t xml:space="preserve">evoluído sob a arquitetura antiga (seis entradas, 74 pesos) deixou de ser utilizável, porque</w:t>
+        <w:t xml:space="preserve">Impacto operacional</w:t>
+      </w:r>
+      <w:r>
+        <w:t xml:space="preserve">: como o executável real chama a mesma função</w:t>
       </w:r>
       <w:r>
         <w:t xml:space="preserve"> </w:t>
@@ -4330,458 +4321,134 @@
         <w:rPr>
           <w:rStyle w:val="VerbatimChar"/>
         </w:rPr>
-        <w:t xml:space="preserve">RedeNeural.Ativar</w:t>
-      </w:r>
-      <w:r>
-        <w:t xml:space="preserve"> </w:t>
-      </w:r>
-      <w:r>
-        <w:t xml:space="preserve">exige que o vetor de entradas tenha exatamente o tamanho declarado pela</w:t>
-      </w:r>
-      <w:r>
-        <w:t xml:space="preserve"> </w:t>
-      </w:r>
-      <w:r>
-        <w:t xml:space="preserve">arquitetura – não há conversão possível entre um genoma de 74 e um de 82 números, nem forma de</w:t>
-      </w:r>
-      <w:r>
-        <w:t xml:space="preserve"> </w:t>
-      </w:r>
-      <w:r>
-        <w:t xml:space="preserve">"completar" o genoma antigo com os oito pesos que faltam sem reavaliar do zero o que a evolução</w:t>
-      </w:r>
-      <w:r>
-        <w:t xml:space="preserve"> </w:t>
-      </w:r>
-      <w:r>
-        <w:t xml:space="preserve">faria com eles. Isso invalidou, de uma só vez, o controlador de produção já embutido no executável</w:t>
-      </w:r>
-      <w:r>
-        <w:t xml:space="preserve"> </w:t>
-      </w:r>
-      <w:r>
-        <w:t xml:space="preserve">(</w:t>
+        <w:t xml:space="preserve">ControladorHibrido.ConstruirEntradas</w:t>
+      </w:r>
+      <w:r>
+        <w:t xml:space="preserve"> </w:t>
+      </w:r>
+      <w:r>
+        <w:t xml:space="preserve">usada no treino, acrescentar uma entrada exige</w:t>
+      </w:r>
+      <w:r>
+        <w:t xml:space="preserve"> </w:t>
+      </w:r>
+      <w:r>
+        <w:t xml:space="preserve">atualizar os dois lados e achar, no sistema real, um valor de verdade equivalente ao conceito</w:t>
+      </w:r>
+      <w:r>
+        <w:t xml:space="preserve"> </w:t>
+      </w:r>
+      <w:r>
+        <w:t xml:space="preserve">simulado – aqui simples, porque</w:t>
+      </w:r>
+      <w:r>
+        <w:t xml:space="preserve"> </w:t>
       </w:r>
       <w:r>
         <w:rPr>
           <w:rStyle w:val="VerbatimChar"/>
         </w:rPr>
-        <w:t xml:space="preserve">Resources/ControladorTreinado/genoma-controlador.json</w:t>
-      </w:r>
-      <w:r>
-        <w:t xml:space="preserve">, treinado sob a arquitetura antiga)</w:t>
-      </w:r>
-      <w:r>
-        <w:t xml:space="preserve"> </w:t>
-      </w:r>
-      <w:r>
-        <w:t xml:space="preserve">e todas as 11 execuções da Seção </w:t>
-      </w:r>
-      <w:hyperlink w:anchor="_119a6bdc6d18c559c5be26f210764d7f901446e">
-        <w:r>
-          <w:rPr>
-            <w:rStyle w:val="Hyperlink"/>
-          </w:rPr>
-          <w:t xml:space="preserve">2.3.6</w:t>
-        </w:r>
-      </w:hyperlink>
-      <w:r>
-        <w:t xml:space="preserve"> </w:t>
-      </w:r>
-      <w:r>
-        <w:t xml:space="preserve">documentadas anteriormente –</w:t>
-      </w:r>
-      <w:r>
-        <w:t xml:space="preserve"> </w:t>
-      </w:r>
-      <w:r>
-        <w:t xml:space="preserve">ambos precisaram ser retreinados do zero sob a nova arquitetura (e, no mesmo retreinamento, sob o</w:t>
-      </w:r>
-      <w:r>
-        <w:t xml:space="preserve"> </w:t>
-      </w:r>
-      <w:r>
-        <w:t xml:space="preserve">ambiente também endurecido, ver próximo parágrafo) para voltarem a valer. Esse acoplamento rígido</w:t>
-      </w:r>
-      <w:r>
-        <w:t xml:space="preserve"> </w:t>
-      </w:r>
-      <w:r>
-        <w:t xml:space="preserve">entre arquitetura e genoma é uma propriedade conhecida de redes neurais simples sem camadas de</w:t>
-      </w:r>
-      <w:r>
-        <w:t xml:space="preserve"> </w:t>
-      </w:r>
-      <w:r>
-        <w:t xml:space="preserve">embedding ou</w:t>
-      </w:r>
-      <w:r>
-        <w:t xml:space="preserve"> </w:t>
-      </w:r>
-      <w:r>
-        <w:rPr>
-          <w:i/>
-          <w:iCs/>
-        </w:rPr>
-        <w:t xml:space="preserve">padding</w:t>
-      </w:r>
-      <w:r>
-        <w:t xml:space="preserve">: cada entrada nova é, na prática, uma mudança de</w:t>
-      </w:r>
-      <w:r>
-        <w:t xml:space="preserve"> </w:t>
-      </w:r>
-      <w:r>
-        <w:rPr>
-          <w:i/>
-          <w:iCs/>
-        </w:rPr>
-        <w:t xml:space="preserve">breaking</w:t>
-      </w:r>
-      <w:r>
-        <w:rPr>
-          <w:i/>
-          <w:iCs/>
-        </w:rPr>
-        <w:t xml:space="preserve"> </w:t>
-      </w:r>
-      <w:r>
-        <w:rPr>
-          <w:i/>
-          <w:iCs/>
-        </w:rPr>
-        <w:t xml:space="preserve">change</w:t>
-      </w:r>
-      <w:r>
-        <w:t xml:space="preserve"> </w:t>
-      </w:r>
-      <w:r>
-        <w:t xml:space="preserve">no formato do genoma, nunca uma extensão compatível com versões anteriores.</w:t>
-      </w:r>
-    </w:p>
-    <w:p>
-      <w:pPr>
-        <w:pStyle w:val="BodyText"/>
-      </w:pPr>
-      <w:r>
-        <w:t xml:space="preserve">O terceiro impacto é operacional, não só experimental: como o próprio executável em produção</w:t>
-      </w:r>
-      <w:r>
-        <w:t xml:space="preserve"> </w:t>
-      </w:r>
-      <w:r>
-        <w:t xml:space="preserve">(</w:t>
-      </w:r>
-      <w:r>
-        <w:rPr>
-          <w:rStyle w:val="VerbatimChar"/>
-        </w:rPr>
-        <w:t xml:space="preserve">TowerSelectionService</w:t>
-      </w:r>
-      <w:r>
-        <w:t xml:space="preserve">) chama a mesma função estática</w:t>
-      </w:r>
-      <w:r>
-        <w:t xml:space="preserve"> </w:t>
-      </w:r>
-      <w:r>
-        <w:rPr>
-          <w:rStyle w:val="VerbatimChar"/>
-        </w:rPr>
-        <w:t xml:space="preserve">ControladorHibrido.ConstruirEntradas</w:t>
-      </w:r>
-      <w:r>
-        <w:t xml:space="preserve"> </w:t>
-      </w:r>
-      <w:r>
-        <w:t xml:space="preserve">usada pelo treinamento – por design, para garantir que a rede treinada receba em campo exatamente a</w:t>
-      </w:r>
-      <w:r>
-        <w:t xml:space="preserve"> </w:t>
-      </w:r>
-      <w:r>
-        <w:t xml:space="preserve">mesma entrada que recebeu durante a evolução –, acrescentar uma entrada obriga a atualizar os DOIS</w:t>
-      </w:r>
-      <w:r>
-        <w:t xml:space="preserve"> </w:t>
-      </w:r>
-      <w:r>
-        <w:t xml:space="preserve">lados ao mesmo tempo, simulação e sistema real, e a localizar, no sistema real, um valor de verdade</w:t>
-      </w:r>
-      <w:r>
-        <w:t xml:space="preserve"> </w:t>
-      </w:r>
-      <w:r>
-        <w:t xml:space="preserve">que corresponda ao conceito simulado. Neste caso a atualização foi simples porque a grandeza já</w:t>
-      </w:r>
-      <w:r>
-        <w:t xml:space="preserve"> </w:t>
-      </w:r>
-      <w:r>
-        <w:t xml:space="preserve">existia no sistema real:</w:t>
-      </w:r>
-      <w:r>
-        <w:t xml:space="preserve"> </w:t>
-      </w:r>
-      <w:r>
-        <w:rPr>
-          <w:rStyle w:val="VerbatimChar"/>
-        </w:rPr>
         <w:t xml:space="preserve">Target.Timestamp</w:t>
       </w:r>
       <w:r>
         <w:t xml:space="preserve"> </w:t>
       </w:r>
       <w:r>
-        <w:t xml:space="preserve">já registrava o instante da primeira detecção de</w:t>
-      </w:r>
-      <w:r>
-        <w:t xml:space="preserve"> </w:t>
-      </w:r>
-      <w:r>
-        <w:t xml:space="preserve">cada alvo (usado para outros fins), bastando calcular</w:t>
-      </w:r>
-      <w:r>
-        <w:t xml:space="preserve"> </w:t>
-      </w:r>
-      <w:r>
-        <w:rPr>
-          <w:rStyle w:val="VerbatimChar"/>
-        </w:rPr>
-        <w:t xml:space="preserve">(DateTime.UtcNow - Target.Timestamp)</w:t>
-      </w:r>
-      <w:r>
-        <w:t xml:space="preserve"> </w:t>
-      </w:r>
-      <w:r>
-        <w:t xml:space="preserve">no ponto de decisão. Esse não é o caso geral – uma entrada hipotética sem contrapartida instrumentada</w:t>
-      </w:r>
-      <w:r>
-        <w:t xml:space="preserve"> </w:t>
-      </w:r>
-      <w:r>
-        <w:t xml:space="preserve">no hardware real teria exigido adicionar sensoriamento ou lógica nova ao sistema físico antes de a</w:t>
-      </w:r>
-      <w:r>
-        <w:t xml:space="preserve"> </w:t>
-      </w:r>
-      <w:r>
-        <w:t xml:space="preserve">rede treinada em simulação poder ser usada de verdade, e não apenas ajustar uma fórmula de</w:t>
-      </w:r>
-      <w:r>
-        <w:t xml:space="preserve"> </w:t>
-      </w:r>
-      <w:r>
-        <w:t xml:space="preserve">normalização.</w:t>
-      </w:r>
-    </w:p>
-    <w:p>
-      <w:pPr>
-        <w:pStyle w:val="BodyText"/>
-      </w:pPr>
-      <w:r>
-        <w:t xml:space="preserve">O quarto impacto foi preventivo: para que a incompatibilidade do segundo impacto não se manifestasse</w:t>
-      </w:r>
-      <w:r>
-        <w:t xml:space="preserve"> </w:t>
-      </w:r>
-      <w:r>
-        <w:t xml:space="preserve">como uma exceção não tratada na primeira seleção de torre real (o que teria travado o aplicativo em</w:t>
-      </w:r>
-      <w:r>
-        <w:t xml:space="preserve"> </w:t>
-      </w:r>
-      <w:r>
-        <w:t xml:space="preserve">produção com o genoma antigo ainda embutido, entre o momento em que o código mudou e o momento em</w:t>
-      </w:r>
-      <w:r>
-        <w:t xml:space="preserve"> </w:t>
-      </w:r>
-      <w:r>
-        <w:t xml:space="preserve">que um novo genoma foi treinado e reembutido), foi adicionada uma verificação explícita de</w:t>
-      </w:r>
-      <w:r>
-        <w:t xml:space="preserve"> </w:t>
-      </w:r>
-      <w:r>
-        <w:t xml:space="preserve">compatibilidade em</w:t>
-      </w:r>
-      <w:r>
-        <w:t xml:space="preserve"> </w:t>
-      </w:r>
-      <w:r>
-        <w:rPr>
-          <w:rStyle w:val="VerbatimChar"/>
-        </w:rPr>
-        <w:t xml:space="preserve">ControladorTreinadoProvider</w:t>
-      </w:r>
-      <w:r>
-        <w:t xml:space="preserve">: antes de instanciar a rede a partir do</w:t>
-      </w:r>
-      <w:r>
-        <w:t xml:space="preserve"> </w:t>
-      </w:r>
-      <w:r>
-        <w:t xml:space="preserve">genoma embutido, o número de entradas declarado no arquivo é comparado ao</w:t>
-      </w:r>
-      <w:r>
-        <w:t xml:space="preserve"> </w:t>
-      </w:r>
-      <w:r>
-        <w:rPr>
-          <w:rStyle w:val="VerbatimChar"/>
-        </w:rPr>
-        <w:t xml:space="preserve">ControladorHibrido.QuantidadeEntradas</w:t>
-      </w:r>
-      <w:r>
-        <w:t xml:space="preserve"> </w:t>
-      </w:r>
-      <w:r>
-        <w:t xml:space="preserve">atual, e qualquer divergência faz o sistema</w:t>
-      </w:r>
-      <w:r>
-        <w:t xml:space="preserve"> </w:t>
-      </w:r>
-      <w:r>
-        <w:t xml:space="preserve">degradar, deliberadamente, para a heurística pura – o mesmo comportamento seguro de "nunca travar,</w:t>
-      </w:r>
-      <w:r>
-        <w:t xml:space="preserve"> </w:t>
-      </w:r>
-      <w:r>
-        <w:t xml:space="preserve">na pior hipótese operar só com a heurística" já descrito para as demais camadas de segurança do</w:t>
-      </w:r>
-      <w:r>
-        <w:t xml:space="preserve"> </w:t>
-      </w:r>
-      <w:r>
-        <w:t xml:space="preserve">controlador híbrido. Esse guarda não existia antes da mudança de arquitetura; passou a existir</w:t>
-      </w:r>
-      <w:r>
-        <w:t xml:space="preserve"> </w:t>
-      </w:r>
-      <w:r>
-        <w:rPr>
-          <w:i/>
-          <w:iCs/>
-        </w:rPr>
-        <w:t xml:space="preserve">por causa</w:t>
-      </w:r>
-      <w:r>
-        <w:t xml:space="preserve"> </w:t>
-      </w:r>
-      <w:r>
-        <w:t xml:space="preserve">dela, e é hoje o que torna seguro acrescentar uma oitava, nona ou décima entrada no</w:t>
-      </w:r>
-      <w:r>
-        <w:t xml:space="preserve"> </w:t>
-      </w:r>
-      <w:r>
-        <w:t xml:space="preserve">futuro sem risco de travar o aplicativo de alguém que ainda não retreinou.</w:t>
-      </w:r>
-    </w:p>
-    <w:p>
-      <w:pPr>
-        <w:pStyle w:val="BodyText"/>
-      </w:pPr>
-      <w:r>
-        <w:t xml:space="preserve">Uma ressalva metodológica fecha esta discussão: a entrada nova e o endurecimento do ambiente de</w:t>
-      </w:r>
-      <w:r>
-        <w:t xml:space="preserve"> </w:t>
-      </w:r>
-      <w:r>
-        <w:t xml:space="preserve">treino (ver próximo parágrafo) foram introduzidos na mesma leva de mudanças e avaliados juntos nas</w:t>
-      </w:r>
-      <w:r>
-        <w:t xml:space="preserve"> </w:t>
-      </w:r>
-      <w:r>
-        <w:t xml:space="preserve">onze execuções da Seção </w:t>
-      </w:r>
-      <w:hyperlink w:anchor="_119a6bdc6d18c559c5be26f210764d7f901446e">
-        <w:r>
-          <w:rPr>
-            <w:rStyle w:val="Hyperlink"/>
-          </w:rPr>
-          <w:t xml:space="preserve">2.3.6</w:t>
-        </w:r>
-      </w:hyperlink>
-      <w:r>
-        <w:t xml:space="preserve">, de modo que este trabalho</w:t>
-      </w:r>
-      <w:r>
-        <w:t xml:space="preserve"> </w:t>
-      </w:r>
+        <w:t xml:space="preserve">já existia; uma entrada sem</w:t>
+      </w:r>
+      <w:r>
+        <w:t xml:space="preserve"> </w:t>
+      </w:r>
+      <w:r>
+        <w:t xml:space="preserve">contrapartida real exigiria sensoriamento novo antes de a rede treinada poder ser usada.</w:t>
+      </w:r>
+    </w:p>
+    <w:p>
+      <w:pPr>
+        <w:pStyle w:val="FirstParagraph"/>
+        <w:numPr>
+          <w:ilvl w:val="0"/>
+          <w:numId w:val="1001"/>
+        </w:numPr>
+      </w:pPr>
       <w:r>
         <w:rPr>
           <w:b/>
           <w:bCs/>
         </w:rPr>
+        <w:t xml:space="preserve">Guarda preventiva</w:t>
+      </w:r>
+      <w:r>
+        <w:t xml:space="preserve">: para a incompatibilidade do item 2 nunca travar o aplicativo em</w:t>
+      </w:r>
+      <w:r>
+        <w:t xml:space="preserve"> </w:t>
+      </w:r>
+      <w:r>
+        <w:t xml:space="preserve">produção,</w:t>
+      </w:r>
+      <w:r>
+        <w:t xml:space="preserve"> </w:t>
+      </w:r>
+      <w:r>
+        <w:rPr>
+          <w:rStyle w:val="VerbatimChar"/>
+        </w:rPr>
+        <w:t xml:space="preserve">ControladorTreinadoProvider</w:t>
+      </w:r>
+      <w:r>
+        <w:t xml:space="preserve"> </w:t>
+      </w:r>
+      <w:r>
+        <w:t xml:space="preserve">passou a comparar o número de entradas do genoma</w:t>
+      </w:r>
+      <w:r>
+        <w:t xml:space="preserve"> </w:t>
+      </w:r>
+      <w:r>
+        <w:t xml:space="preserve">embutido com o da arquitetura atual, degradando para a heurística pura em caso de divergência –</w:t>
+      </w:r>
+      <w:r>
+        <w:t xml:space="preserve"> </w:t>
+      </w:r>
+      <w:r>
+        <w:t xml:space="preserve">o mesmo princípio de segurança das demais camadas do controlador híbrido.</w:t>
+      </w:r>
+    </w:p>
+    <w:p>
+      <w:pPr>
+        <w:pStyle w:val="FirstParagraph"/>
+      </w:pPr>
+      <w:r>
+        <w:t xml:space="preserve">Ressalva metodológica: a entrada nova e o endurecimento do ambiente de treino (próximo parágrafo)</w:t>
+      </w:r>
+      <w:r>
+        <w:t xml:space="preserve"> </w:t>
+      </w:r>
+      <w:r>
+        <w:t xml:space="preserve">foram introduzidos juntos e avaliados nas mesmas onze execuções, de modo que este trabalho</w:t>
+      </w:r>
+      <w:r>
+        <w:t xml:space="preserve"> </w:t>
+      </w:r>
+      <w:r>
+        <w:rPr>
+          <w:b/>
+          <w:bCs/>
+        </w:rPr>
         <w:t xml:space="preserve">não</w:t>
       </w:r>
       <w:r>
         <w:t xml:space="preserve"> </w:t>
       </w:r>
       <w:r>
-        <w:t xml:space="preserve">isola o efeito de ter mais uma entrada do efeito de o ambiente ter ficado mais difícil – os dados</w:t>
-      </w:r>
-      <w:r>
-        <w:t xml:space="preserve"> </w:t>
-      </w:r>
-      <w:r>
-        <w:t xml:space="preserve">aqui não permitem afirmar que a sétima entrada, por si só, melhorou (ou piorou) a qualidade do</w:t>
-      </w:r>
-      <w:r>
-        <w:t xml:space="preserve"> </w:t>
-      </w:r>
-      <w:r>
-        <w:t xml:space="preserve">controlador. Uma comparação controlada, com a sétima entrada mas no ambiente ANTIGO (sem invasão de</w:t>
-      </w:r>
-      <w:r>
-        <w:t xml:space="preserve"> </w:t>
-      </w:r>
-      <w:r>
-        <w:t xml:space="preserve">torre nem teto por quadrante), ou vice-versa, é o experimento de ablação natural para isolar essa</w:t>
-      </w:r>
-      <w:r>
-        <w:t xml:space="preserve"> </w:t>
-      </w:r>
-      <w:r>
-        <w:t xml:space="preserve">pergunta, e fica registrada aqui como trabalho futuro específico, distinto da ablação</w:t>
-      </w:r>
-      <w:r>
-        <w:t xml:space="preserve"> </w:t>
-      </w:r>
-      <w:r>
-        <w:t xml:space="preserve">heurística-</w:t>
-      </w:r>
-      <w:r>
-        <w:rPr>
-          <w:i/>
-          <w:iCs/>
-        </w:rPr>
-        <w:t xml:space="preserve">vs</w:t>
-      </w:r>
-      <w:r>
-        <w:t xml:space="preserve">-rede já conduzida (Seção </w:t>
-      </w:r>
-      <w:hyperlink w:anchor="_119a6bdc6d18c559c5be26f210764d7f901446e">
-        <w:r>
-          <w:rPr>
-            <w:rStyle w:val="Hyperlink"/>
-          </w:rPr>
-          <w:t xml:space="preserve">2.3.6</w:t>
-        </w:r>
-      </w:hyperlink>
-      <w:r>
-        <w:t xml:space="preserve">) e distinto</w:t>
-      </w:r>
-      <w:r>
-        <w:t xml:space="preserve"> </w:t>
-      </w:r>
-      <w:r>
-        <w:t xml:space="preserve">também da repetição com múltiplas sementes já apontada como limitação geral.</w:t>
+        <w:t xml:space="preserve">isola o efeito de uma coisa do efeito da outra – uma comparação controlada com a</w:t>
+      </w:r>
+      <w:r>
+        <w:t xml:space="preserve"> </w:t>
+      </w:r>
+      <w:r>
+        <w:t xml:space="preserve">sétima entrada no ambiente antigo (ou vice-versa) fica registrada como trabalho futuro específico.</w:t>
       </w:r>
     </w:p>
     <w:p>
@@ -5307,7 +4974,7 @@
         <w:pStyle w:val="FirstParagraph"/>
         <w:numPr>
           <w:ilvl w:val="0"/>
-          <w:numId w:val="1001"/>
+          <w:numId w:val="1002"/>
         </w:numPr>
       </w:pPr>
       <w:r>
@@ -5337,172 +5004,6 @@
       </w:r>
       <w:r>
         <w:t xml:space="preserve">quadrante de cobertura coincide com o do alvo está livre, só elas concorrem.</w:t>
-      </w:r>
-    </w:p>
-    <w:p>
-      <w:pPr>
-        <w:pStyle w:val="FirstParagraph"/>
-        <w:numPr>
-          <w:ilvl w:val="0"/>
-          <w:numId w:val="1001"/>
-        </w:numPr>
-      </w:pPr>
-      <w:r>
-        <w:rPr>
-          <w:b/>
-          <w:bCs/>
-        </w:rPr>
-        <w:t xml:space="preserve">Torre de quadrante adjacente</w:t>
-      </w:r>
-      <w:r>
-        <w:t xml:space="preserve"> </w:t>
-      </w:r>
-      <w:r>
-        <w:t xml:space="preserve">(</w:t>
-      </w:r>
-      <w:r>
-        <w:rPr>
-          <w:rStyle w:val="VerbatimChar"/>
-        </w:rPr>
-        <w:t xml:space="preserve">fatorCamada = 0,5</w:t>
-      </w:r>
-      <w:r>
-        <w:t xml:space="preserve">): só entra em jogo se a</w:t>
-      </w:r>
-      <w:r>
-        <w:t xml:space="preserve"> </w:t>
-      </w:r>
-      <w:r>
-        <w:t xml:space="preserve">camada 1 estiver vazia – e, dentro dela, só concorrem torres cujo PRÓPRIO quadrante não tenha</w:t>
-      </w:r>
-      <w:r>
-        <w:t xml:space="preserve"> </w:t>
-      </w:r>
-      <w:r>
-        <w:t xml:space="preserve">neste momento outro alvo ativo concorrente (não ajuda quem precisa de si mesma em casa).</w:t>
-      </w:r>
-    </w:p>
-    <w:p>
-      <w:pPr>
-        <w:pStyle w:val="FirstParagraph"/>
-        <w:numPr>
-          <w:ilvl w:val="0"/>
-          <w:numId w:val="1001"/>
-        </w:numPr>
-      </w:pPr>
-      <w:r>
-        <w:rPr>
-          <w:b/>
-          <w:bCs/>
-        </w:rPr>
-        <w:t xml:space="preserve">Torre sobressalente/qualquer livre</w:t>
-      </w:r>
-      <w:r>
-        <w:t xml:space="preserve"> </w:t>
-      </w:r>
-      <w:r>
-        <w:t xml:space="preserve">(</w:t>
-      </w:r>
-      <w:r>
-        <w:rPr>
-          <w:rStyle w:val="VerbatimChar"/>
-        </w:rPr>
-        <w:t xml:space="preserve">fatorCamada = 0,0</w:t>
-      </w:r>
-      <w:r>
-        <w:t xml:space="preserve">): cobertura de</w:t>
-      </w:r>
-      <w:r>
-        <w:t xml:space="preserve"> </w:t>
-      </w:r>
-      <w:r>
-        <w:t xml:space="preserve">último recurso, só quando as camadas 1 e 2 estão ambas vazias – qualquer torre livre do sistema,</w:t>
-      </w:r>
-      <w:r>
-        <w:t xml:space="preserve"> </w:t>
-      </w:r>
-      <w:r>
-        <w:t xml:space="preserve">mesmo diagonalmente oposta ao alvo, é melhor do que deixá-lo sem nenhuma torre perseguindo.</w:t>
-      </w:r>
-    </w:p>
-    <w:p>
-      <w:pPr>
-        <w:pStyle w:val="FirstParagraph"/>
-      </w:pPr>
-      <w:r>
-        <w:t xml:space="preserve">Se nenhuma torre está livre em NENHUMA camada ("sobrecarregada"), o alvo fica sem torre selecionada</w:t>
-      </w:r>
-      <w:r>
-        <w:t xml:space="preserve"> </w:t>
-      </w:r>
-      <w:r>
-        <w:t xml:space="preserve">até alguma liberar – nunca há fila de espera ou reserva antecipada. Dentro da camada escolhida, a</w:t>
-      </w:r>
-      <w:r>
-        <w:t xml:space="preserve"> </w:t>
-      </w:r>
-      <w:r>
-        <w:t xml:space="preserve">pontuação de cada candidata é a combinação heurística+rede descrita na seção anterior</w:t>
-      </w:r>
-      <w:r>
-        <w:t xml:space="preserve"> </w:t>
-      </w:r>
-      <w:r>
-        <w:t xml:space="preserve">(</w:t>
-      </w:r>
-      <w:r>
-        <w:rPr>
-          <w:rStyle w:val="VerbatimChar"/>
-        </w:rPr>
-        <w:t xml:space="preserve">ControladorHibrido.Pontuar</w:t>
-      </w:r>
-      <w:r>
-        <w:t xml:space="preserve">), ou simplesmente a menor distância se nenhum controlador</w:t>
-      </w:r>
-      <w:r>
-        <w:t xml:space="preserve"> </w:t>
-      </w:r>
-      <w:r>
-        <w:t xml:space="preserve">treinado estiver embutido (heurística pura de fábrica).</w:t>
-      </w:r>
-    </w:p>
-    <w:p>
-      <w:pPr>
-        <w:pStyle w:val="Heading4"/>
-      </w:pPr>
-      <w:bookmarkStart w:id="33" w:name="_36a56452c43695544dab3c17be393d136591513"/>
-      <w:r>
-        <w:t xml:space="preserve">Cinco regras de refinamento (</w:t>
-      </w:r>
-      <w:r>
-        <w:rPr>
-          <w:rStyle w:val="VerbatimChar"/>
-        </w:rPr>
-        <w:t xml:space="preserve">TowerSelectionService</w:t>
-      </w:r>
-      <w:r>
-        <w:t xml:space="preserve">), as quatro primeiras</w:t>
-      </w:r>
-      <w:r>
-        <w:t xml:space="preserve"> </w:t>
-      </w:r>
-      <w:r>
-        <w:t xml:space="preserve">desligáveis individualmente na tela de Configurações, a quinta sempre ativa.</w:t>
-      </w:r>
-      <w:bookmarkEnd w:id="33"/>
-    </w:p>
-    <w:p>
-      <w:pPr>
-        <w:pStyle w:val="FirstParagraph"/>
-      </w:pPr>
-      <w:r>
-        <w:t xml:space="preserve">Aplicadas depois da</w:t>
-      </w:r>
-      <w:r>
-        <w:t xml:space="preserve"> </w:t>
-      </w:r>
-      <w:r>
-        <w:t xml:space="preserve">cascata de camadas, nesta ordem lógica:</w:t>
       </w:r>
     </w:p>
     <w:p>
@@ -5518,31 +5019,34 @@
           <w:b/>
           <w:bCs/>
         </w:rPr>
-        <w:t xml:space="preserve">Anti-oscilação.</w:t>
-      </w:r>
-      <w:r>
-        <w:t xml:space="preserve"> </w:t>
-      </w:r>
-      <w:r>
-        <w:t xml:space="preserve">Se a torre JÁ comprometida com o alvo continua sendo uma candidata</w:t>
-      </w:r>
-      <w:r>
-        <w:t xml:space="preserve"> </w:t>
-      </w:r>
-      <w:r>
-        <w:t xml:space="preserve">válida e sua pontuação está dentro de uma margem de empate da vencedora (0,3 m sem rede, ou 0,1</w:t>
-      </w:r>
-      <w:r>
-        <w:t xml:space="preserve"> </w:t>
-      </w:r>
-      <w:r>
-        <w:t xml:space="preserve">ponto com rede embutida), a torre atual é mantida – evita trocar de torre por uma diferença de</w:t>
-      </w:r>
-      <w:r>
-        <w:t xml:space="preserve"> </w:t>
-      </w:r>
-      <w:r>
-        <w:t xml:space="preserve">pontuação irrelevante, causada por ruído de leitura, quando a torre atual ainda serve bem.</w:t>
+        <w:t xml:space="preserve">Torre de quadrante adjacente</w:t>
+      </w:r>
+      <w:r>
+        <w:t xml:space="preserve"> </w:t>
+      </w:r>
+      <w:r>
+        <w:t xml:space="preserve">(</w:t>
+      </w:r>
+      <w:r>
+        <w:rPr>
+          <w:rStyle w:val="VerbatimChar"/>
+        </w:rPr>
+        <w:t xml:space="preserve">fatorCamada = 0,5</w:t>
+      </w:r>
+      <w:r>
+        <w:t xml:space="preserve">): só entra em jogo se a</w:t>
+      </w:r>
+      <w:r>
+        <w:t xml:space="preserve"> </w:t>
+      </w:r>
+      <w:r>
+        <w:t xml:space="preserve">camada 1 estiver vazia – e, dentro dela, só concorrem torres cujo PRÓPRIO quadrante não tenha</w:t>
+      </w:r>
+      <w:r>
+        <w:t xml:space="preserve"> </w:t>
+      </w:r>
+      <w:r>
+        <w:t xml:space="preserve">neste momento outro alvo ativo concorrente (não ajuda quem precisa de si mesma em casa).</w:t>
       </w:r>
     </w:p>
     <w:p>
@@ -5551,6 +5055,169 @@
         <w:numPr>
           <w:ilvl w:val="0"/>
           <w:numId w:val="1002"/>
+        </w:numPr>
+      </w:pPr>
+      <w:r>
+        <w:rPr>
+          <w:b/>
+          <w:bCs/>
+        </w:rPr>
+        <w:t xml:space="preserve">Torre sobressalente/qualquer livre</w:t>
+      </w:r>
+      <w:r>
+        <w:t xml:space="preserve"> </w:t>
+      </w:r>
+      <w:r>
+        <w:t xml:space="preserve">(</w:t>
+      </w:r>
+      <w:r>
+        <w:rPr>
+          <w:rStyle w:val="VerbatimChar"/>
+        </w:rPr>
+        <w:t xml:space="preserve">fatorCamada = 0,0</w:t>
+      </w:r>
+      <w:r>
+        <w:t xml:space="preserve">): cobertura de</w:t>
+      </w:r>
+      <w:r>
+        <w:t xml:space="preserve"> </w:t>
+      </w:r>
+      <w:r>
+        <w:t xml:space="preserve">último recurso, só quando as camadas 1 e 2 estão ambas vazias – qualquer torre livre do sistema,</w:t>
+      </w:r>
+      <w:r>
+        <w:t xml:space="preserve"> </w:t>
+      </w:r>
+      <w:r>
+        <w:t xml:space="preserve">mesmo diagonalmente oposta ao alvo, é melhor do que deixá-lo sem nenhuma torre perseguindo.</w:t>
+      </w:r>
+    </w:p>
+    <w:p>
+      <w:pPr>
+        <w:pStyle w:val="FirstParagraph"/>
+      </w:pPr>
+      <w:r>
+        <w:t xml:space="preserve">Se nenhuma torre está livre em NENHUMA camada ("sobrecarregada"), o alvo fica sem torre selecionada</w:t>
+      </w:r>
+      <w:r>
+        <w:t xml:space="preserve"> </w:t>
+      </w:r>
+      <w:r>
+        <w:t xml:space="preserve">até alguma liberar – nunca há fila de espera ou reserva antecipada. Dentro da camada escolhida, a</w:t>
+      </w:r>
+      <w:r>
+        <w:t xml:space="preserve"> </w:t>
+      </w:r>
+      <w:r>
+        <w:t xml:space="preserve">pontuação de cada candidata é a combinação heurística+rede descrita na seção anterior</w:t>
+      </w:r>
+      <w:r>
+        <w:t xml:space="preserve"> </w:t>
+      </w:r>
+      <w:r>
+        <w:t xml:space="preserve">(</w:t>
+      </w:r>
+      <w:r>
+        <w:rPr>
+          <w:rStyle w:val="VerbatimChar"/>
+        </w:rPr>
+        <w:t xml:space="preserve">ControladorHibrido.Pontuar</w:t>
+      </w:r>
+      <w:r>
+        <w:t xml:space="preserve">), ou simplesmente a menor distância se nenhum controlador</w:t>
+      </w:r>
+      <w:r>
+        <w:t xml:space="preserve"> </w:t>
+      </w:r>
+      <w:r>
+        <w:t xml:space="preserve">treinado estiver embutido (heurística pura de fábrica).</w:t>
+      </w:r>
+    </w:p>
+    <w:p>
+      <w:pPr>
+        <w:pStyle w:val="Heading4"/>
+      </w:pPr>
+      <w:bookmarkStart w:id="33" w:name="_36a56452c43695544dab3c17be393d136591513"/>
+      <w:r>
+        <w:t xml:space="preserve">Cinco regras de refinamento (</w:t>
+      </w:r>
+      <w:r>
+        <w:rPr>
+          <w:rStyle w:val="VerbatimChar"/>
+        </w:rPr>
+        <w:t xml:space="preserve">TowerSelectionService</w:t>
+      </w:r>
+      <w:r>
+        <w:t xml:space="preserve">), as quatro primeiras</w:t>
+      </w:r>
+      <w:r>
+        <w:t xml:space="preserve"> </w:t>
+      </w:r>
+      <w:r>
+        <w:t xml:space="preserve">desligáveis individualmente na tela de Configurações, a quinta sempre ativa.</w:t>
+      </w:r>
+      <w:bookmarkEnd w:id="33"/>
+    </w:p>
+    <w:p>
+      <w:pPr>
+        <w:pStyle w:val="FirstParagraph"/>
+      </w:pPr>
+      <w:r>
+        <w:t xml:space="preserve">Aplicadas depois da</w:t>
+      </w:r>
+      <w:r>
+        <w:t xml:space="preserve"> </w:t>
+      </w:r>
+      <w:r>
+        <w:t xml:space="preserve">cascata de camadas, nesta ordem lógica:</w:t>
+      </w:r>
+    </w:p>
+    <w:p>
+      <w:pPr>
+        <w:pStyle w:val="FirstParagraph"/>
+        <w:numPr>
+          <w:ilvl w:val="0"/>
+          <w:numId w:val="1003"/>
+        </w:numPr>
+      </w:pPr>
+      <w:r>
+        <w:rPr>
+          <w:b/>
+          <w:bCs/>
+        </w:rPr>
+        <w:t xml:space="preserve">Anti-oscilação.</w:t>
+      </w:r>
+      <w:r>
+        <w:t xml:space="preserve"> </w:t>
+      </w:r>
+      <w:r>
+        <w:t xml:space="preserve">Se a torre JÁ comprometida com o alvo continua sendo uma candidata</w:t>
+      </w:r>
+      <w:r>
+        <w:t xml:space="preserve"> </w:t>
+      </w:r>
+      <w:r>
+        <w:t xml:space="preserve">válida e sua pontuação está dentro de uma margem de empate da vencedora (0,3 m sem rede, ou 0,1</w:t>
+      </w:r>
+      <w:r>
+        <w:t xml:space="preserve"> </w:t>
+      </w:r>
+      <w:r>
+        <w:t xml:space="preserve">ponto com rede embutida), a torre atual é mantida – evita trocar de torre por uma diferença de</w:t>
+      </w:r>
+      <w:r>
+        <w:t xml:space="preserve"> </w:t>
+      </w:r>
+      <w:r>
+        <w:t xml:space="preserve">pontuação irrelevante, causada por ruído de leitura, quando a torre atual ainda serve bem.</w:t>
+      </w:r>
+    </w:p>
+    <w:p>
+      <w:pPr>
+        <w:pStyle w:val="FirstParagraph"/>
+        <w:numPr>
+          <w:ilvl w:val="0"/>
+          <w:numId w:val="1003"/>
         </w:numPr>
       </w:pPr>
       <w:r>
@@ -5610,7 +5277,7 @@
         <w:pStyle w:val="FirstParagraph"/>
         <w:numPr>
           <w:ilvl w:val="0"/>
-          <w:numId w:val="1002"/>
+          <w:numId w:val="1003"/>
         </w:numPr>
       </w:pPr>
       <w:r>
@@ -5643,190 +5310,6 @@
       </w:r>
       <w:r>
         <w:t xml:space="preserve">uma métrica histórica persistida.</w:t>
-      </w:r>
-    </w:p>
-    <w:p>
-      <w:pPr>
-        <w:pStyle w:val="FirstParagraph"/>
-        <w:numPr>
-          <w:ilvl w:val="0"/>
-          <w:numId w:val="1002"/>
-        </w:numPr>
-      </w:pPr>
-      <w:r>
-        <w:rPr>
-          <w:b/>
-          <w:bCs/>
-        </w:rPr>
-        <w:t xml:space="preserve">Predição de trajetória.</w:t>
-      </w:r>
-      <w:r>
-        <w:t xml:space="preserve"> </w:t>
-      </w:r>
-      <w:r>
-        <w:t xml:space="preserve">O ângulo de mira aponta para onde o alvo estará 0,3 s no</w:t>
-      </w:r>
-      <w:r>
-        <w:t xml:space="preserve"> </w:t>
-      </w:r>
-      <w:r>
-        <w:t xml:space="preserve">futuro, projetado a partir da velocidade estimada (zero no primeiro instante de detecção, sem</w:t>
-      </w:r>
-      <w:r>
-        <w:t xml:space="preserve"> </w:t>
-      </w:r>
-      <w:r>
-        <w:t xml:space="preserve">histórico ainda) – não para a posição atual. Afeta só a mira exibida/calculada, nunca a escolha</w:t>
-      </w:r>
-      <w:r>
-        <w:t xml:space="preserve"> </w:t>
-      </w:r>
-      <w:r>
-        <w:t xml:space="preserve">de QUAL torre.</w:t>
-      </w:r>
-    </w:p>
-    <w:p>
-      <w:pPr>
-        <w:pStyle w:val="FirstParagraph"/>
-        <w:numPr>
-          <w:ilvl w:val="0"/>
-          <w:numId w:val="1002"/>
-        </w:numPr>
-      </w:pPr>
-      <w:r>
-        <w:rPr>
-          <w:b/>
-          <w:bCs/>
-        </w:rPr>
-        <w:t xml:space="preserve">Ajuda de torre adjacente contra alvo rápido (sempre ativa).</w:t>
-      </w:r>
-      <w:r>
-        <w:t xml:space="preserve"> </w:t>
-      </w:r>
-      <w:r>
-        <w:t xml:space="preserve">Alvos com velocidade</w:t>
-      </w:r>
-      <w:r>
-        <w:t xml:space="preserve"> </w:t>
-      </w:r>
-      <w:r>
-        <w:t xml:space="preserve">igual ou acima do limiar configurado de "alvo rápido" recebem, além da torre principal, QUALQUER</w:t>
-      </w:r>
-      <w:r>
-        <w:t xml:space="preserve"> </w:t>
-      </w:r>
-      <w:r>
-        <w:t xml:space="preserve">torre de quadrante adjacente a até 2 m de distância do alvo – mesmo fora do alcance normal de</w:t>
-      </w:r>
-      <w:r>
-        <w:t xml:space="preserve"> </w:t>
-      </w:r>
-      <w:r>
-        <w:t xml:space="preserve">câmera – como reforço de disparo. Um segundo canhão reduz a chance de o alvo escapar de um tiro</w:t>
-      </w:r>
-      <w:r>
-        <w:t xml:space="preserve"> </w:t>
-      </w:r>
-      <w:r>
-        <w:t xml:space="preserve">único, já que a probabilidade de erro cresce com a velocidade</w:t>
-      </w:r>
-      <w:r>
-        <w:t xml:space="preserve"> </w:t>
-      </w:r>
-      <w:r>
-        <w:t xml:space="preserve">(</w:t>
-      </w:r>
-      <w:r>
-        <w:rPr>
-          <w:rStyle w:val="VerbatimChar"/>
-        </w:rPr>
-        <w:t xml:space="preserve">Helpers.CalculadoraErroDisparo</w:t>
-      </w:r>
-      <w:r>
-        <w:t xml:space="preserve">). É a única das cinco regras sem interruptor na tela de</w:t>
-      </w:r>
-      <w:r>
-        <w:t xml:space="preserve"> </w:t>
-      </w:r>
-      <w:r>
-        <w:t xml:space="preserve">Configurações; só o limiar de velocidade que a aciona é ajustável.</w:t>
-      </w:r>
-    </w:p>
-    <w:p>
-      <w:pPr>
-        <w:pStyle w:val="FirstParagraph"/>
-      </w:pPr>
-      <w:r>
-        <w:t xml:space="preserve">Uma regra adicional, implícita e sempre ativa, nunca listada entre as cinco acima porque não é uma</w:t>
-      </w:r>
-      <w:r>
-        <w:t xml:space="preserve"> </w:t>
-      </w:r>
-      <w:r>
-        <w:t xml:space="preserve">preferência e sim uma restrição física: nenhuma torre é candidata, em nenhuma camada, se outra torre</w:t>
-      </w:r>
-      <w:r>
-        <w:t xml:space="preserve"> </w:t>
-      </w:r>
-      <w:r>
-        <w:t xml:space="preserve">qualquer estiver posicionada geometricamente entre ela e o alvo dentro de um corredor estreito de</w:t>
-      </w:r>
-      <w:r>
-        <w:t xml:space="preserve"> </w:t>
-      </w:r>
-      <w:r>
-        <w:t xml:space="preserve">0,3 m – ela bloquearia o próprio tiro.</w:t>
-      </w:r>
-    </w:p>
-    <w:p>
-      <w:pPr>
-        <w:pStyle w:val="Heading4"/>
-      </w:pPr>
-      <w:bookmarkStart w:id="34" w:name="_e6a6d0d3211a34d05c33af3de624e21cf3de8e3"/>
-      <w:r>
-        <w:t xml:space="preserve">Vetos finais, sempre ativos, no momento da autorização de disparo</w:t>
-      </w:r>
-      <w:r>
-        <w:t xml:space="preserve"> </w:t>
-      </w:r>
-      <w:r>
-        <w:t xml:space="preserve">(</w:t>
-      </w:r>
-      <w:r>
-        <w:rPr>
-          <w:rStyle w:val="VerbatimChar"/>
-        </w:rPr>
-        <w:t xml:space="preserve">FireControlService.Authorize</w:t>
-      </w:r>
-      <w:r>
-        <w:t xml:space="preserve">).</w:t>
-      </w:r>
-      <w:bookmarkEnd w:id="34"/>
-    </w:p>
-    <w:p>
-      <w:pPr>
-        <w:pStyle w:val="FirstParagraph"/>
-      </w:pPr>
-      <w:r>
-        <w:t xml:space="preserve">Mesmo com uma torre já selecionada, nenhum comando de</w:t>
-      </w:r>
-      <w:r>
-        <w:t xml:space="preserve"> </w:t>
-      </w:r>
-      <w:r>
-        <w:t xml:space="preserve">acionamento sai do sistema sem passar por TODOS estes critérios, verificados nesta ordem e</w:t>
-      </w:r>
-      <w:r>
-        <w:t xml:space="preserve"> </w:t>
-      </w:r>
-      <w:r>
-        <w:t xml:space="preserve">reavaliados a cada tentativa (uma torre selecionada agora pode ser vetada mais tarde, se a condição</w:t>
-      </w:r>
-      <w:r>
-        <w:t xml:space="preserve"> </w:t>
-      </w:r>
-      <w:r>
-        <w:t xml:space="preserve">mudar entre a seleção e o disparo):</w:t>
       </w:r>
     </w:p>
     <w:p>
@@ -5838,13 +5321,35 @@
         </w:numPr>
       </w:pPr>
       <w:r>
-        <w:t xml:space="preserve">O alvo precisa continuar ativo (não pode ter saído de cena entre a seleção e a tentativa de</w:t>
-      </w:r>
-      <w:r>
-        <w:t xml:space="preserve"> </w:t>
-      </w:r>
-      <w:r>
-        <w:t xml:space="preserve">disparo).</w:t>
+        <w:rPr>
+          <w:b/>
+          <w:bCs/>
+        </w:rPr>
+        <w:t xml:space="preserve">Predição de trajetória.</w:t>
+      </w:r>
+      <w:r>
+        <w:t xml:space="preserve"> </w:t>
+      </w:r>
+      <w:r>
+        <w:t xml:space="preserve">O ângulo de mira aponta para onde o alvo estará 0,3 s no</w:t>
+      </w:r>
+      <w:r>
+        <w:t xml:space="preserve"> </w:t>
+      </w:r>
+      <w:r>
+        <w:t xml:space="preserve">futuro, projetado a partir da velocidade estimada (zero no primeiro instante de detecção, sem</w:t>
+      </w:r>
+      <w:r>
+        <w:t xml:space="preserve"> </w:t>
+      </w:r>
+      <w:r>
+        <w:t xml:space="preserve">histórico ainda) – não para a posição atual. Afeta só a mira exibida/calculada, nunca a escolha</w:t>
+      </w:r>
+      <w:r>
+        <w:t xml:space="preserve"> </w:t>
+      </w:r>
+      <w:r>
+        <w:t xml:space="preserve">de QUAL torre.</w:t>
       </w:r>
     </w:p>
     <w:p>
@@ -5856,28 +5361,139 @@
         </w:numPr>
       </w:pPr>
       <w:r>
-        <w:t xml:space="preserve">O sistema precisa estar no modo operacional</w:t>
-      </w:r>
-      <w:r>
-        <w:t xml:space="preserve"> </w:t>
+        <w:rPr>
+          <w:b/>
+          <w:bCs/>
+        </w:rPr>
+        <w:t xml:space="preserve">Ajuda de torre adjacente contra alvo rápido (sempre ativa).</w:t>
+      </w:r>
+      <w:r>
+        <w:t xml:space="preserve"> </w:t>
+      </w:r>
+      <w:r>
+        <w:t xml:space="preserve">Alvos com velocidade</w:t>
+      </w:r>
+      <w:r>
+        <w:t xml:space="preserve"> </w:t>
+      </w:r>
+      <w:r>
+        <w:t xml:space="preserve">igual ou acima do limiar configurado de "alvo rápido" recebem, além da torre principal, QUALQUER</w:t>
+      </w:r>
+      <w:r>
+        <w:t xml:space="preserve"> </w:t>
+      </w:r>
+      <w:r>
+        <w:t xml:space="preserve">torre de quadrante adjacente a até 2 m de distância do alvo – mesmo fora do alcance normal de</w:t>
+      </w:r>
+      <w:r>
+        <w:t xml:space="preserve"> </w:t>
+      </w:r>
+      <w:r>
+        <w:t xml:space="preserve">câmera – como reforço de disparo. Um segundo canhão reduz a chance de o alvo escapar de um tiro</w:t>
+      </w:r>
+      <w:r>
+        <w:t xml:space="preserve"> </w:t>
+      </w:r>
+      <w:r>
+        <w:t xml:space="preserve">único, já que a probabilidade de erro cresce com a velocidade</w:t>
+      </w:r>
+      <w:r>
+        <w:t xml:space="preserve"> </w:t>
+      </w:r>
+      <w:r>
+        <w:t xml:space="preserve">(</w:t>
       </w:r>
       <w:r>
         <w:rPr>
           <w:rStyle w:val="VerbatimChar"/>
         </w:rPr>
-        <w:t xml:space="preserve">Disparar</w:t>
-      </w:r>
-      <w:r>
-        <w:t xml:space="preserve"> </w:t>
-      </w:r>
-      <w:r>
-        <w:t xml:space="preserve">– qualquer outro modo</w:t>
-      </w:r>
-      <w:r>
-        <w:t xml:space="preserve"> </w:t>
-      </w:r>
-      <w:r>
-        <w:t xml:space="preserve">bloqueia incondicionalmente.</w:t>
+        <w:t xml:space="preserve">Helpers.CalculadoraErroDisparo</w:t>
+      </w:r>
+      <w:r>
+        <w:t xml:space="preserve">). É a única das cinco regras sem interruptor na tela de</w:t>
+      </w:r>
+      <w:r>
+        <w:t xml:space="preserve"> </w:t>
+      </w:r>
+      <w:r>
+        <w:t xml:space="preserve">Configurações; só o limiar de velocidade que a aciona é ajustável.</w:t>
+      </w:r>
+    </w:p>
+    <w:p>
+      <w:pPr>
+        <w:pStyle w:val="FirstParagraph"/>
+      </w:pPr>
+      <w:r>
+        <w:t xml:space="preserve">Uma regra adicional, implícita e sempre ativa, nunca listada entre as cinco acima porque não é uma</w:t>
+      </w:r>
+      <w:r>
+        <w:t xml:space="preserve"> </w:t>
+      </w:r>
+      <w:r>
+        <w:t xml:space="preserve">preferência e sim uma restrição física: nenhuma torre é candidata, em nenhuma camada, se outra torre</w:t>
+      </w:r>
+      <w:r>
+        <w:t xml:space="preserve"> </w:t>
+      </w:r>
+      <w:r>
+        <w:t xml:space="preserve">qualquer estiver posicionada geometricamente entre ela e o alvo dentro de um corredor estreito de</w:t>
+      </w:r>
+      <w:r>
+        <w:t xml:space="preserve"> </w:t>
+      </w:r>
+      <w:r>
+        <w:t xml:space="preserve">0,3 m – ela bloquearia o próprio tiro.</w:t>
+      </w:r>
+    </w:p>
+    <w:p>
+      <w:pPr>
+        <w:pStyle w:val="Heading4"/>
+      </w:pPr>
+      <w:bookmarkStart w:id="34" w:name="_e6a6d0d3211a34d05c33af3de624e21cf3de8e3"/>
+      <w:r>
+        <w:t xml:space="preserve">Vetos finais, sempre ativos, no momento da autorização de disparo</w:t>
+      </w:r>
+      <w:r>
+        <w:t xml:space="preserve"> </w:t>
+      </w:r>
+      <w:r>
+        <w:t xml:space="preserve">(</w:t>
+      </w:r>
+      <w:r>
+        <w:rPr>
+          <w:rStyle w:val="VerbatimChar"/>
+        </w:rPr>
+        <w:t xml:space="preserve">FireControlService.Authorize</w:t>
+      </w:r>
+      <w:r>
+        <w:t xml:space="preserve">).</w:t>
+      </w:r>
+      <w:bookmarkEnd w:id="34"/>
+    </w:p>
+    <w:p>
+      <w:pPr>
+        <w:pStyle w:val="FirstParagraph"/>
+      </w:pPr>
+      <w:r>
+        <w:t xml:space="preserve">Mesmo com uma torre já selecionada, nenhum comando de</w:t>
+      </w:r>
+      <w:r>
+        <w:t xml:space="preserve"> </w:t>
+      </w:r>
+      <w:r>
+        <w:t xml:space="preserve">acionamento sai do sistema sem passar por TODOS estes critérios, verificados nesta ordem e</w:t>
+      </w:r>
+      <w:r>
+        <w:t xml:space="preserve"> </w:t>
+      </w:r>
+      <w:r>
+        <w:t xml:space="preserve">reavaliados a cada tentativa (uma torre selecionada agora pode ser vetada mais tarde, se a condição</w:t>
+      </w:r>
+      <w:r>
+        <w:t xml:space="preserve"> </w:t>
+      </w:r>
+      <w:r>
+        <w:t xml:space="preserve">mudar entre a seleção e o disparo):</w:t>
       </w:r>
     </w:p>
     <w:p>
@@ -5885,32 +5501,17 @@
         <w:pStyle w:val="FirstParagraph"/>
         <w:numPr>
           <w:ilvl w:val="0"/>
-          <w:numId w:val="1003"/>
+          <w:numId w:val="1004"/>
         </w:numPr>
       </w:pPr>
       <w:r>
-        <w:t xml:space="preserve">A certeza de identificação do alvo (percentual de confiança acumulado pela câmera) precisa</w:t>
-      </w:r>
-      <w:r>
-        <w:t xml:space="preserve"> </w:t>
-      </w:r>
-      <w:r>
-        <w:t xml:space="preserve">ser maior ou igual ao limiar mínimo configurado (</w:t>
-      </w:r>
-      <w:r>
-        <w:rPr>
-          <w:rStyle w:val="VerbatimChar"/>
-        </w:rPr>
-        <w:t xml:space="preserve">LimiarConfiancaDisparoPercentual</w:t>
-      </w:r>
-      <w:r>
-        <w:t xml:space="preserve">) –</w:t>
-      </w:r>
-      <w:r>
-        <w:t xml:space="preserve"> </w:t>
-      </w:r>
-      <w:r>
-        <w:t xml:space="preserve">nunca abaixo do piso absoluto do sistema.</w:t>
+        <w:t xml:space="preserve">O alvo precisa continuar ativo (não pode ter saído de cena entre a seleção e a tentativa de</w:t>
+      </w:r>
+      <w:r>
+        <w:t xml:space="preserve"> </w:t>
+      </w:r>
+      <w:r>
+        <w:t xml:space="preserve">disparo).</w:t>
       </w:r>
     </w:p>
     <w:p>
@@ -5918,7 +5519,73 @@
         <w:pStyle w:val="FirstParagraph"/>
         <w:numPr>
           <w:ilvl w:val="0"/>
-          <w:numId w:val="1003"/>
+          <w:numId w:val="1004"/>
+        </w:numPr>
+      </w:pPr>
+      <w:r>
+        <w:t xml:space="preserve">O sistema precisa estar no modo operacional</w:t>
+      </w:r>
+      <w:r>
+        <w:t xml:space="preserve"> </w:t>
+      </w:r>
+      <w:r>
+        <w:rPr>
+          <w:rStyle w:val="VerbatimChar"/>
+        </w:rPr>
+        <w:t xml:space="preserve">Disparar</w:t>
+      </w:r>
+      <w:r>
+        <w:t xml:space="preserve"> </w:t>
+      </w:r>
+      <w:r>
+        <w:t xml:space="preserve">– qualquer outro modo</w:t>
+      </w:r>
+      <w:r>
+        <w:t xml:space="preserve"> </w:t>
+      </w:r>
+      <w:r>
+        <w:t xml:space="preserve">bloqueia incondicionalmente.</w:t>
+      </w:r>
+    </w:p>
+    <w:p>
+      <w:pPr>
+        <w:pStyle w:val="FirstParagraph"/>
+        <w:numPr>
+          <w:ilvl w:val="0"/>
+          <w:numId w:val="1004"/>
+        </w:numPr>
+      </w:pPr>
+      <w:r>
+        <w:t xml:space="preserve">A certeza de identificação do alvo (percentual de confiança acumulado pela câmera) precisa</w:t>
+      </w:r>
+      <w:r>
+        <w:t xml:space="preserve"> </w:t>
+      </w:r>
+      <w:r>
+        <w:t xml:space="preserve">ser maior ou igual ao limiar mínimo configurado (</w:t>
+      </w:r>
+      <w:r>
+        <w:rPr>
+          <w:rStyle w:val="VerbatimChar"/>
+        </w:rPr>
+        <w:t xml:space="preserve">LimiarConfiancaDisparoPercentual</w:t>
+      </w:r>
+      <w:r>
+        <w:t xml:space="preserve">) –</w:t>
+      </w:r>
+      <w:r>
+        <w:t xml:space="preserve"> </w:t>
+      </w:r>
+      <w:r>
+        <w:t xml:space="preserve">nunca abaixo do piso absoluto do sistema.</w:t>
+      </w:r>
+    </w:p>
+    <w:p>
+      <w:pPr>
+        <w:pStyle w:val="FirstParagraph"/>
+        <w:numPr>
+          <w:ilvl w:val="0"/>
+          <w:numId w:val="1004"/>
         </w:numPr>
       </w:pPr>
       <w:r>
@@ -7438,9 +7105,9 @@
       <w:pPr>
         <w:pStyle w:val="Heading4"/>
       </w:pPr>
-      <w:bookmarkStart w:id="37" w:name="_a2cefdb07f7bddd89a8761fb0112c17ea4aaa09"/>
-      <w:r>
-        <w:t xml:space="preserve">Efeito sobre a qualidade final do controlador: o teto desapareceu por completo.</w:t>
+      <w:bookmarkStart w:id="37" w:name="_ca8e640fc565f27d4b369078ba8d5d598d19a14"/>
+      <w:r>
+        <w:t xml:space="preserve">Resultado: o teto desapareceu, e os hiperparâmetros deixaram de importar.</w:t>
       </w:r>
       <w:bookmarkEnd w:id="37"/>
     </w:p>
@@ -7449,90 +7116,150 @@
         <w:pStyle w:val="FirstParagraph"/>
       </w:pPr>
       <w:r>
-        <w:t xml:space="preserve">A Tabela </w:t>
-      </w:r>
-      <w:hyperlink w:anchor="_7f39135e6e1b1019c583f73d23562e81f1f9703">
-        <w:r>
-          <w:rPr>
-            <w:rStyle w:val="Hyperlink"/>
-          </w:rPr>
-          <w:t xml:space="preserve">3</w:t>
-        </w:r>
-      </w:hyperlink>
-      <w:r>
-        <w:t xml:space="preserve"> </w:t>
-      </w:r>
-      <w:r>
-        <w:t xml:space="preserve">substitui integralmente a Figura de fitness final da</w:t>
-      </w:r>
-      <w:r>
-        <w:t xml:space="preserve"> </w:t>
-      </w:r>
-      <w:r>
-        <w:t xml:space="preserve">versão anterior deste experimento (seis entradas, ambiente sem invasão de torre nem penalidade de</w:t>
-      </w:r>
-      <w:r>
-        <w:t xml:space="preserve"> </w:t>
-      </w:r>
-      <w:r>
-        <w:t xml:space="preserve">desequilíbrio): naquela versão, as nove combinações de população e arquitetura terminavam numa</w:t>
-      </w:r>
-      <w:r>
-        <w:t xml:space="preserve"> </w:t>
-      </w:r>
-      <w:r>
-        <w:t xml:space="preserve">faixa estreita mas ainda perceptível, de 55,59 a 57,27 (variação de 3%). Com o ambiente endurecido</w:t>
-      </w:r>
-      <w:r>
-        <w:t xml:space="preserve"> </w:t>
-      </w:r>
-      <w:r>
-        <w:t xml:space="preserve">e a arquitetura de sete entradas, essa faixa praticamente desaparece – as onze execuções terminam</w:t>
-      </w:r>
-      <w:r>
-        <w:t xml:space="preserve"> </w:t>
-      </w:r>
-      <w:r>
-        <w:t xml:space="preserve">entre 68,33 e 68,34, uma variação de 0,01 ponto, e</w:t>
-      </w:r>
-      <w:r>
-        <w:t xml:space="preserve"> </w:t>
-      </w:r>
-      <w:r>
-        <w:rPr>
-          <w:b/>
-          <w:bCs/>
-        </w:rPr>
-        <w:t xml:space="preserve">todas atingem esse valor exatamente na</w:t>
-      </w:r>
-      <w:r>
-        <w:rPr>
-          <w:b/>
-          <w:bCs/>
-        </w:rPr>
-        <w:t xml:space="preserve"> </w:t>
-      </w:r>
-      <w:r>
-        <w:rPr>
-          <w:b/>
-          <w:bCs/>
-        </w:rPr>
-        <w:t xml:space="preserve">mesma geração, 222</w:t>
-      </w:r>
-      <w:r>
-        <w:t xml:space="preserve">, independentemente de população (30 a 120), arquitetura (4 a 16 neurônios</w:t>
-      </w:r>
-      <w:r>
-        <w:t xml:space="preserve"> </w:t>
-      </w:r>
-      <w:r>
-        <w:t xml:space="preserve">ocultos) ou taxa de mutação (0,04 a 0,16). Isso não é o mesmo resultado do experimento anterior</w:t>
-      </w:r>
-      <w:r>
-        <w:t xml:space="preserve"> </w:t>
-      </w:r>
-      <w:r>
-        <w:t xml:space="preserve">levado ao extremo por acaso: é uma mudança estrutural na tarefa. Os cenários táticos obrigatórios</w:t>
+        <w:t xml:space="preserve">Diferente da versão anterior deste experimento (seis entradas, variação de 3% entre as nove</w:t>
+      </w:r>
+      <w:r>
+        <w:t xml:space="preserve"> </w:t>
+      </w:r>
+      <w:r>
+        <w:t xml:space="preserve">combinações), as onze execuções agora terminam entre 68,33 e 68,34 – uma variação de 0,01 ponto –</w:t>
+      </w:r>
+      <w:r>
+        <w:t xml:space="preserve"> </w:t>
+      </w:r>
+      <w:r>
+        <w:t xml:space="preserve">e todas atingem esse valor na mesma geração, 222, independentemente de população (30 a 120),</w:t>
+      </w:r>
+      <w:r>
+        <w:t xml:space="preserve"> </w:t>
+      </w:r>
+      <w:r>
+        <w:t xml:space="preserve">arquitetura (4 a 16 neurônios) ou mutação (0,04 a 0,16). A causa é estrutural: os cenários táticos</w:t>
+      </w:r>
+      <w:r>
+        <w:t xml:space="preserve"> </w:t>
+      </w:r>
+      <w:r>
+        <w:t xml:space="preserve">obrigatórios (</w:t>
+      </w:r>
+      <w:r>
+        <w:rPr>
+          <w:rStyle w:val="VerbatimChar"/>
+        </w:rPr>
+        <w:t xml:space="preserve">CatalogoCenarios.TodosComScript</w:t>
+      </w:r>
+      <w:r>
+        <w:t xml:space="preserve">) são um conjunto pequeno e fixo, e o ambiente</w:t>
+      </w:r>
+      <w:r>
+        <w:t xml:space="preserve"> </w:t>
+      </w:r>
+      <w:r>
+        <w:t xml:space="preserve">endurecido tornou esse conjunto fácil de saturar – qualquer genoma competente esgota a recompensa</w:t>
+      </w:r>
+      <w:r>
+        <w:t xml:space="preserve"> </w:t>
+      </w:r>
+      <w:r>
+        <w:t xml:space="preserve">disponível bem antes das 300 gerações, e a partir daí não há mais nada que diferencie um</w:t>
+      </w:r>
+      <w:r>
+        <w:t xml:space="preserve"> </w:t>
+      </w:r>
+      <w:r>
+        <w:t xml:space="preserve">hiperparâmetro do outro. As curvas de convergência (gerações 25–200) ainda mostram o padrão</w:t>
+      </w:r>
+      <w:r>
+        <w:t xml:space="preserve"> </w:t>
+      </w:r>
+      <w:r>
+        <w:t xml:space="preserve">esperado antes do teto – mutação alta explora rápido e trava, mutação baixa refina mais devagar –,</w:t>
+      </w:r>
+      <w:r>
+        <w:t xml:space="preserve"> </w:t>
+      </w:r>
+      <w:r>
+        <w:t xml:space="preserve">mas todas convergem ao mesmo valor por volta da geração 222. O tempo de treinamento continua</w:t>
+      </w:r>
+      <w:r>
+        <w:t xml:space="preserve"> </w:t>
+      </w:r>
+      <w:r>
+        <w:t xml:space="preserve">escalando só com a população (3,3–3,6 s em 30; 6,3–8,2 s em 60; 11,3–20,5 s em 120), não com a</w:t>
+      </w:r>
+      <w:r>
+        <w:t xml:space="preserve"> </w:t>
+      </w:r>
+      <w:r>
+        <w:t xml:space="preserve">arquitetura, pela mesma razão de sempre: o custo é dominado pelos episódios simulados por geração,</w:t>
+      </w:r>
+      <w:r>
+        <w:t xml:space="preserve"> </w:t>
+      </w:r>
+      <w:r>
+        <w:t xml:space="preserve">não pelo tamanho da rede.</w:t>
+      </w:r>
+    </w:p>
+    <w:p>
+      <w:pPr>
+        <w:pStyle w:val="BodyText"/>
+      </w:pPr>
+      <w:r>
+        <w:t xml:space="preserve">A conclusão para o RadarTorres permanece de custo-benefício, agora mais categórica: sem nenhuma</w:t>
+      </w:r>
+      <w:r>
+        <w:t xml:space="preserve"> </w:t>
+      </w:r>
+      <w:r>
+        <w:t xml:space="preserve">evidência que justifique população ou camada oculta maiores, a configuração de produção (60</w:t>
+      </w:r>
+      <w:r>
+        <w:t xml:space="preserve"> </w:t>
+      </w:r>
+      <w:r>
+        <w:t xml:space="preserve">indivíduos, 8 neurônios, mutação 0,08) segue sustentada por ser a mais testada, não por superar as</w:t>
+      </w:r>
+      <w:r>
+        <w:t xml:space="preserve"> </w:t>
+      </w:r>
+      <w:r>
+        <w:t xml:space="preserve">demais. Duas ressalvas delimitam o alcance disso: a saturação é uma propriedade do conjunto FIXO de</w:t>
+      </w:r>
+      <w:r>
+        <w:t xml:space="preserve"> </w:t>
+      </w:r>
+      <w:r>
+        <w:t xml:space="preserve">cenários desta bateria, não necessariamente do treinamento de produção (que também usa cenários</w:t>
+      </w:r>
+      <w:r>
+        <w:t xml:space="preserve"> </w:t>
+      </w:r>
+      <w:r>
+        <w:t xml:space="preserve">aleatórios); e cada configuração é uma única execução, não uma média de sementes independentes.</w:t>
+      </w:r>
+    </w:p>
+    <w:p>
+      <w:pPr>
+        <w:pStyle w:val="Heading4"/>
+      </w:pPr>
+      <w:bookmarkStart w:id="38" w:name="_6f6ca97711e47e30f12b65921c0a5477e5441d6"/>
+      <w:r>
+        <w:t xml:space="preserve">Teste direto: o teto é da rede ou da duração fixa do episódio?</w:t>
+      </w:r>
+      <w:bookmarkEnd w:id="38"/>
+    </w:p>
+    <w:p>
+      <w:pPr>
+        <w:pStyle w:val="FirstParagraph"/>
+      </w:pPr>
+      <w:r>
+        <w:t xml:space="preserve">Uma forma mais direta de responder a essa pergunta, sem depender dos cenários táticos fixos, é</w:t>
+      </w:r>
+      <w:r>
+        <w:t xml:space="preserve"> </w:t>
+      </w:r>
+      <w:r>
+        <w:t xml:space="preserve">remover a própria causa suspeita: a duração fixa do episódio. Foi adicionado um modo de avaliação</w:t>
       </w:r>
       <w:r>
         <w:t xml:space="preserve"> </w:t>
@@ -7544,40 +7271,100 @@
         <w:rPr>
           <w:rStyle w:val="VerbatimChar"/>
         </w:rPr>
-        <w:t xml:space="preserve">CatalogoCenarios.TodosComScript</w:t>
-      </w:r>
-      <w:r>
-        <w:t xml:space="preserve">) são um conjunto pequeno e fixo de situações</w:t>
-      </w:r>
-      <w:r>
-        <w:t xml:space="preserve"> </w:t>
-      </w:r>
-      <w:r>
-        <w:t xml:space="preserve">determinísticas; sob o ambiente endurecido, há um teto de pontuação alcançável nesse conjunto fixo</w:t>
-      </w:r>
-      <w:r>
-        <w:t xml:space="preserve"> </w:t>
-      </w:r>
-      <w:r>
-        <w:t xml:space="preserve">de cenários que qualquer genoma minimamente competente atinge com folga antes mesmo de terminar as</w:t>
-      </w:r>
-      <w:r>
-        <w:t xml:space="preserve"> </w:t>
-      </w:r>
-      <w:r>
-        <w:t xml:space="preserve">300 gerações – a partir daí, não existe mais recompensa disponível para diferenciar um</w:t>
-      </w:r>
-      <w:r>
-        <w:t xml:space="preserve"> </w:t>
-      </w:r>
-      <w:r>
-        <w:t xml:space="preserve">hiperparâmetro do outro, e a busca genética simplesmente para de ter o que otimizar. Em outras</w:t>
-      </w:r>
-      <w:r>
-        <w:t xml:space="preserve"> </w:t>
-      </w:r>
-      <w:r>
-        <w:t xml:space="preserve">palavras, o endurecimento do ambiente tornou a bateria de cenários fixos</w:t>
+        <w:t xml:space="preserve">ParametrosTreinamento.SemLimiteDeDuracao</w:t>
+      </w:r>
+      <w:r>
+        <w:t xml:space="preserve">) em que o episódio IGNORA os 45 s normais e só</w:t>
+      </w:r>
+      <w:r>
+        <w:t xml:space="preserve"> </w:t>
+      </w:r>
+      <w:r>
+        <w:t xml:space="preserve">termina quando um alvo de fato rompe uma torre (ou aos 1800 s de uma salvaguarda, nunca atingida nos</w:t>
+      </w:r>
+      <w:r>
+        <w:t xml:space="preserve"> </w:t>
+      </w:r>
+      <w:r>
+        <w:t xml:space="preserve">testes) – a escalada de dificuldade continua usando os 45 s como referência de ritmo, só o corte</w:t>
+      </w:r>
+      <w:r>
+        <w:t xml:space="preserve"> </w:t>
+      </w:r>
+      <w:r>
+        <w:t xml:space="preserve">abrupto por tempo é desligado. O genoma de produção já treinado (pico de fitness 193,57 em</w:t>
+      </w:r>
+      <w:r>
+        <w:t xml:space="preserve"> </w:t>
+      </w:r>
+      <w:r>
+        <w:t xml:space="preserve">treinamento, dentro do limite normal de 45 s) foi avaliado assim em 40 episódios independentes, sem</w:t>
+      </w:r>
+      <w:r>
+        <w:t xml:space="preserve"> </w:t>
+      </w:r>
+      <w:r>
+        <w:t xml:space="preserve">nenhuma mudança na rede. O resultado desfaz a pergunta original em duas partes, não uma resposta</w:t>
+      </w:r>
+      <w:r>
+        <w:t xml:space="preserve"> </w:t>
+      </w:r>
+      <w:r>
+        <w:t xml:space="preserve">única: o fitness MÁXIMO observado sobe para 443,23 – quase o triplo do teto de produção e acima da</w:t>
+      </w:r>
+      <w:r>
+        <w:t xml:space="preserve"> </w:t>
+      </w:r>
+      <w:r>
+        <w:t xml:space="preserve">meta de 300 que motivou este experimento –, confirmando que a duração fixa de fato interrompia</w:t>
+      </w:r>
+      <w:r>
+        <w:t xml:space="preserve"> </w:t>
+      </w:r>
+      <w:r>
+        <w:t xml:space="preserve">episódios que ainda tinham pontuação disponível; mas o fitness MÉDIO (82,35) e a duração média até a</w:t>
+      </w:r>
+      <w:r>
+        <w:t xml:space="preserve"> </w:t>
+      </w:r>
+      <w:r>
+        <w:t xml:space="preserve">invasão de uma torre (29,2 s, variando de 5,4 s a 87,4 s) mostram que boa parte dos episódios termina</w:t>
+      </w:r>
+      <w:r>
+        <w:t xml:space="preserve"> </w:t>
+      </w:r>
+      <w:r>
+        <w:t xml:space="preserve">por falha real do controlador bem ANTES dos 45 s originais, não por causa do corte. Em outras</w:t>
+      </w:r>
+      <w:r>
+        <w:t xml:space="preserve"> </w:t>
+      </w:r>
+      <w:r>
+        <w:t xml:space="preserve">palavras, o teto observado em produção não é puramente "o episódio é curto demais" – é a combinação</w:t>
+      </w:r>
+      <w:r>
+        <w:t xml:space="preserve"> </w:t>
+      </w:r>
+      <w:r>
+        <w:t xml:space="preserve">de um corte de tempo que, de fato, tira pontuação de episódios bem-sucedidos, com uma robustez do</w:t>
+      </w:r>
+      <w:r>
+        <w:t xml:space="preserve"> </w:t>
+      </w:r>
+      <w:r>
+        <w:t xml:space="preserve">controlador ainda insuficiente para evitar falhas precoces numa fração considerável dos cenários.</w:t>
+      </w:r>
+      <w:r>
+        <w:t xml:space="preserve"> </w:t>
+      </w:r>
+      <w:r>
+        <w:t xml:space="preserve">Isso aponta para dois trabalhos futuros distintos, não um só: alongar o horizonte de treinamento</w:t>
+      </w:r>
+      <w:r>
+        <w:t xml:space="preserve"> </w:t>
+      </w:r>
+      <w:r>
+        <w:t xml:space="preserve">(para a rede aprender a explorar episódios longos e bem-sucedidos) e reduzir a variância entre</w:t>
       </w:r>
       <w:r>
         <w:t xml:space="preserve"> </w:t>
@@ -7587,608 +7374,42 @@
           <w:i/>
           <w:iCs/>
         </w:rPr>
-        <w:t xml:space="preserve">mais fácil de</w:t>
-      </w:r>
-      <w:r>
-        <w:rPr>
-          <w:i/>
-          <w:iCs/>
-        </w:rPr>
-        <w:t xml:space="preserve"> </w:t>
-      </w:r>
-      <w:r>
-        <w:rPr>
-          <w:i/>
-          <w:iCs/>
-        </w:rPr>
-        <w:t xml:space="preserve">saturar</w:t>
-      </w:r>
-      <w:r>
-        <w:t xml:space="preserve">, não mais difícil de aprender – o oposto do que se esperaria de regras mais punitivas, e</w:t>
-      </w:r>
-      <w:r>
-        <w:t xml:space="preserve"> </w:t>
-      </w:r>
-      <w:r>
-        <w:t xml:space="preserve">evidência de que o verdadeiro desafio do ambiente atual está no treinamento com cenários aleatórios</w:t>
-      </w:r>
-      <w:r>
-        <w:t xml:space="preserve"> </w:t>
-      </w:r>
-      <w:r>
-        <w:t xml:space="preserve">(Seção </w:t>
-      </w:r>
-      <w:hyperlink w:anchor="_a9dfe2aaa1b7a692030aac1c105e37c4dd850c5">
-        <w:r>
-          <w:rPr>
-            <w:rStyle w:val="Hyperlink"/>
-          </w:rPr>
-          <w:t xml:space="preserve">2.5</w:t>
-        </w:r>
-      </w:hyperlink>
-      <w:r>
-        <w:t xml:space="preserve">), não nesta bateria fixa historicamente usada para comparar</w:t>
-      </w:r>
-      <w:r>
-        <w:t xml:space="preserve"> </w:t>
-      </w:r>
-      <w:r>
-        <w:t xml:space="preserve">hiperparâmetros.</w:t>
+        <w:t xml:space="preserve">seeds</w:t>
+      </w:r>
+      <w:r>
+        <w:t xml:space="preserve"> </w:t>
+      </w:r>
+      <w:r>
+        <w:t xml:space="preserve">(o número inteiro que inicializa o gerador de números pseudoaleatórios do episódio</w:t>
+      </w:r>
+      <w:r>
+        <w:t xml:space="preserve"> </w:t>
+      </w:r>
+      <w:r>
+        <w:t xml:space="preserve">– a mesma seed sempre produz exatamente os mesmos alvos, nas mesmas posições e velocidades, byte a</w:t>
+      </w:r>
+      <w:r>
+        <w:t xml:space="preserve"> </w:t>
+      </w:r>
+      <w:r>
+        <w:t xml:space="preserve">byte) (para a rede falhar com menos frequência nos cenários desfavoráveis), sendo este segundo,</w:t>
+      </w:r>
+      <w:r>
+        <w:t xml:space="preserve"> </w:t>
+      </w:r>
+      <w:r>
+        <w:t xml:space="preserve">pelos dados aqui, o fator que mais pesa na média atual.</w:t>
       </w:r>
     </w:p>
     <w:p>
       <w:pPr>
         <w:pStyle w:val="Heading4"/>
       </w:pPr>
-      <w:bookmarkStart w:id="38" w:name="_4cd710e3b30dba4cad19b52ab025894f3d102b0"/>
-      <w:r>
-        <w:t xml:space="preserve">Efeito sobre a velocidade de evolução: ainda existe, mas só antes do teto.</w:t>
-      </w:r>
-      <w:bookmarkEnd w:id="38"/>
-    </w:p>
-    <w:p>
-      <w:pPr>
-        <w:pStyle w:val="FirstParagraph"/>
-      </w:pPr>
-      <w:r>
-        <w:t xml:space="preserve">Apesar do teto final idêntico, as curvas de convergência (gerações 25, 50, 100 e 200, disponíveis no</w:t>
-      </w:r>
-      <w:r>
-        <w:t xml:space="preserve"> </w:t>
-      </w:r>
-      <w:r>
-        <w:t xml:space="preserve">JSON exportado) ainda diferem entre as taxas de mutação antes de alcançá-lo. Com população 60 e 8</w:t>
-      </w:r>
-      <w:r>
-        <w:t xml:space="preserve"> </w:t>
-      </w:r>
-      <w:r>
-        <w:t xml:space="preserve">neurônios ocultos, a mutação 0,16 lidera no início (59,13 na geração 25, contra 57,48 das outras</w:t>
-      </w:r>
-      <w:r>
-        <w:t xml:space="preserve"> </w:t>
-      </w:r>
-      <w:r>
-        <w:t xml:space="preserve">duas) mas estagna logo depois (62,43 na geração 200); a mutação 0,08 é a que mais se aproxima do</w:t>
-      </w:r>
-      <w:r>
-        <w:t xml:space="preserve"> </w:t>
-      </w:r>
-      <w:r>
-        <w:t xml:space="preserve">teto antes do fim (68,31 já na geração 200); e a mutação 0,04 fica no meio (65,68 na geração 200).</w:t>
-      </w:r>
-      <w:r>
-        <w:t xml:space="preserve"> </w:t>
-      </w:r>
-      <w:r>
-        <w:t xml:space="preserve">O padrão é o mesmo do experimento anterior – mutação alta explora rápido e depois trava, mutação</w:t>
-      </w:r>
-      <w:r>
-        <w:t xml:space="preserve"> </w:t>
-      </w:r>
-      <w:r>
-        <w:t xml:space="preserve">baixa refina mais lentamente –, só que agora as três acabam convergindo ao mesmo teto por volta da</w:t>
-      </w:r>
-      <w:r>
-        <w:t xml:space="preserve"> </w:t>
-      </w:r>
-      <w:r>
-        <w:t xml:space="preserve">geração 222, em vez de pararem em valores finais diferentes. O compromisso clássico entre exploração</w:t>
-      </w:r>
-      <w:r>
-        <w:t xml:space="preserve"> </w:t>
-      </w:r>
-      <w:r>
-        <w:t xml:space="preserve">e explotação continua presente na trajetória; deixou de ser visível no resultado final porque o</w:t>
-      </w:r>
-      <w:r>
-        <w:t xml:space="preserve"> </w:t>
-      </w:r>
-      <w:r>
-        <w:t xml:space="preserve">resultado final deixou de ter margem para diferenciá-las.</w:t>
-      </w:r>
-    </w:p>
-    <w:p>
-      <w:pPr>
-        <w:pStyle w:val="Heading4"/>
-      </w:pPr>
-      <w:bookmarkStart w:id="39" w:name="_25b3ecadba9786f6a0e83c64fcd85227e01a282"/>
-      <w:r>
-        <w:t xml:space="preserve">Custo computacional: a população continua sendo o único fator relevante.</w:t>
+      <w:bookmarkStart w:id="39" w:name="_1bf2000792916e0bed441329e6a871d37499b4e"/>
+      <w:r>
+        <w:t xml:space="preserve">A variância é da rede, do ambiente, ou da avaliação do algoritmo genético?</w:t>
       </w:r>
       <w:bookmarkEnd w:id="39"/>
-    </w:p>
-    <w:p>
-      <w:pPr>
-        <w:pStyle w:val="FirstParagraph"/>
-      </w:pPr>
-      <w:r>
-        <w:t xml:space="preserve">A última coluna da Tabela </w:t>
-      </w:r>
-      <w:hyperlink w:anchor="_7f39135e6e1b1019c583f73d23562e81f1f9703">
-        <w:r>
-          <w:rPr>
-            <w:rStyle w:val="Hyperlink"/>
-          </w:rPr>
-          <w:t xml:space="preserve">3</w:t>
-        </w:r>
-      </w:hyperlink>
-      <w:r>
-        <w:t xml:space="preserve"> </w:t>
-      </w:r>
-      <w:r>
-        <w:t xml:space="preserve">confirma, com o ambiente novo, a mesma</w:t>
-      </w:r>
-      <w:r>
-        <w:t xml:space="preserve"> </w:t>
-      </w:r>
-      <w:r>
-        <w:t xml:space="preserve">conclusão do experimento anterior: o tempo de treinamento escala com o tamanho da população (3,3 a</w:t>
-      </w:r>
-      <w:r>
-        <w:t xml:space="preserve"> </w:t>
-      </w:r>
-      <w:r>
-        <w:t xml:space="preserve">3,6 s em população 30; 6,3 a 8,2 s em população 60; 11,3 a 20,5 s em população 120 – um fator de</w:t>
-      </w:r>
-      <w:r>
-        <w:t xml:space="preserve"> </w:t>
-      </w:r>
-      <w:r>
-        <w:t xml:space="preserve">aproximadamente</w:t>
-      </w:r>
-      <w:r>
-        <w:t xml:space="preserve"> </w:t>
-      </w:r>
-      <m:oMath>
-        <m:r>
-          <m:t>3</m:t>
-        </m:r>
-        <m:r>
-          <m:rPr>
-            <m:sty m:val="p"/>
-          </m:rPr>
-          <m:t>×</m:t>
-        </m:r>
-      </m:oMath>
-      <w:r>
-        <w:t xml:space="preserve"> </w:t>
-      </w:r>
-      <w:r>
-        <w:t xml:space="preserve">a</w:t>
-      </w:r>
-      <w:r>
-        <w:t xml:space="preserve"> </w:t>
-      </w:r>
-      <m:oMath>
-        <m:r>
-          <m:t>6</m:t>
-        </m:r>
-        <m:r>
-          <m:rPr>
-            <m:sty m:val="p"/>
-          </m:rPr>
-          <m:t>×</m:t>
-        </m:r>
-      </m:oMath>
-      <w:r>
-        <w:t xml:space="preserve"> </w:t>
-      </w:r>
-      <w:r>
-        <w:t xml:space="preserve">entre os extremos) e varia muito menos, e sem uma direção</w:t>
-      </w:r>
-      <w:r>
-        <w:t xml:space="preserve"> </w:t>
-      </w:r>
-      <w:r>
-        <w:t xml:space="preserve">consistente, com o número de neurônios ocultos. A razão é a mesma de antes: o custo é dominado pela</w:t>
-      </w:r>
-      <w:r>
-        <w:t xml:space="preserve"> </w:t>
-      </w:r>
-      <w:r>
-        <w:t xml:space="preserve">quantidade de episódios simulados por geração (um por indivíduo da população), não pelo tamanho da</w:t>
-      </w:r>
-      <w:r>
-        <w:t xml:space="preserve"> </w:t>
-      </w:r>
-      <w:r>
-        <w:t xml:space="preserve">rede avaliada em cada episódio – mesmo com 7 entradas em vez de 6, a rede continua pequena demais</w:t>
-      </w:r>
-      <w:r>
-        <w:t xml:space="preserve"> </w:t>
-      </w:r>
-      <w:r>
-        <w:t xml:space="preserve">para que sua propagação pese diante do custo de simular o ambiente. A maior variação não-monotônica</w:t>
-      </w:r>
-      <w:r>
-        <w:t xml:space="preserve"> </w:t>
-      </w:r>
-      <w:r>
-        <w:t xml:space="preserve">entre arquiteturas nesta rodada (por exemplo, 120/16 levando 20,5 s contra 11,3 s de 120/4) é</w:t>
-      </w:r>
-      <w:r>
-        <w:t xml:space="preserve"> </w:t>
-      </w:r>
-      <w:r>
-        <w:t xml:space="preserve">compatível com a nova mecânica de fim antecipado de episódio por invasão de torre: episódios que</w:t>
-      </w:r>
-      <w:r>
-        <w:t xml:space="preserve"> </w:t>
-      </w:r>
-      <w:r>
-        <w:t xml:space="preserve">terminam mais cedo custam menos tempo de simulação, e qual genoma de uma população específica sofre</w:t>
-      </w:r>
-      <w:r>
-        <w:t xml:space="preserve"> </w:t>
-      </w:r>
-      <w:r>
-        <w:t xml:space="preserve">invasão antecipada em qual geração é, em si, estocástico – uma fonte de ruído de tempo que o</w:t>
-      </w:r>
-      <w:r>
-        <w:t xml:space="preserve"> </w:t>
-      </w:r>
-      <w:r>
-        <w:t xml:space="preserve">ambiente anterior, sem fim antecipado, não tinha.</w:t>
-      </w:r>
-    </w:p>
-    <w:p>
-      <w:pPr>
-        <w:pStyle w:val="Heading4"/>
-      </w:pPr>
-      <w:bookmarkStart w:id="40" w:name="_9822b449897884b85d8a4d67ef4a53b3cce6c96"/>
-      <w:r>
-        <w:t xml:space="preserve">Conclusão e escolha dos hiperparâmetros.</w:t>
-      </w:r>
-      <w:bookmarkEnd w:id="40"/>
-    </w:p>
-    <w:p>
-      <w:pPr>
-        <w:pStyle w:val="FirstParagraph"/>
-      </w:pPr>
-      <w:r>
-        <w:t xml:space="preserve">A conclusão para o RadarTorres permanece de custo-benefício, agora ainda mais categórica: com todas</w:t>
-      </w:r>
-      <w:r>
-        <w:t xml:space="preserve"> </w:t>
-      </w:r>
-      <w:r>
-        <w:t xml:space="preserve">as onze configurações atingindo o mesmo teto de fitness na mesma geração, não há absolutamente</w:t>
-      </w:r>
-      <w:r>
-        <w:t xml:space="preserve"> </w:t>
-      </w:r>
-      <w:r>
-        <w:t xml:space="preserve">nenhuma evidência – nem mesmo a variação de 3% observada antes do endurecimento do ambiente – que</w:t>
-      </w:r>
-      <w:r>
-        <w:t xml:space="preserve"> </w:t>
-      </w:r>
-      <w:r>
-        <w:t xml:space="preserve">justifique o gasto adicional de uma população maior ou de uma camada oculta maior. A configuração de</w:t>
-      </w:r>
-      <w:r>
-        <w:t xml:space="preserve"> </w:t>
-      </w:r>
-      <w:r>
-        <w:t xml:space="preserve">produção (população 60, 8 neurônios ocultos, mutação 0,08) permanece sustentada não por superar as</w:t>
-      </w:r>
-      <w:r>
-        <w:t xml:space="preserve"> </w:t>
-      </w:r>
-      <w:r>
-        <w:t xml:space="preserve">demais, mas por ser a escolha de fábrica mais testada e por não haver custo de oportunidade</w:t>
-      </w:r>
-      <w:r>
-        <w:t xml:space="preserve"> </w:t>
-      </w:r>
-      <w:r>
-        <w:t xml:space="preserve">mensurável em mantê-la.</w:t>
-      </w:r>
-    </w:p>
-    <w:p>
-      <w:pPr>
-        <w:pStyle w:val="BodyText"/>
-      </w:pPr>
-      <w:r>
-        <w:t xml:space="preserve">Duas ressalvas, na mesma linha das já apontadas na Seção </w:t>
-      </w:r>
-      <w:hyperlink w:anchor="_29b429726cba63934d066e6dc9a4d2a7670c19d">
-        <w:r>
-          <w:rPr>
-            <w:rStyle w:val="Hyperlink"/>
-          </w:rPr>
-          <w:t xml:space="preserve">2.2</w:t>
-        </w:r>
-      </w:hyperlink>
-      <w:r>
-        <w:t xml:space="preserve">,</w:t>
-      </w:r>
-      <w:r>
-        <w:t xml:space="preserve"> </w:t>
-      </w:r>
-      <w:r>
-        <w:t xml:space="preserve">delimitam o alcance desta conclusão. A primeira é que a saturação observada é uma propriedade do</w:t>
-      </w:r>
-      <w:r>
-        <w:t xml:space="preserve"> </w:t>
-      </w:r>
-      <w:r>
-        <w:t xml:space="preserve">conjunto FIXO de cenários táticos usado nesta bateria (</w:t>
-      </w:r>
-      <w:r>
-        <w:rPr>
-          <w:rStyle w:val="VerbatimChar"/>
-        </w:rPr>
-        <w:t xml:space="preserve">CatalogoCenarios.TodosComScript</w:t>
-      </w:r>
-      <w:r>
-        <w:t xml:space="preserve">), e</w:t>
-      </w:r>
-      <w:r>
-        <w:t xml:space="preserve"> </w:t>
-      </w:r>
-      <w:r>
-        <w:t xml:space="preserve">não necessariamente do treinamento de produção, que também avalia cenários aleatórios – o teto</w:t>
-      </w:r>
-      <w:r>
-        <w:t xml:space="preserve"> </w:t>
-      </w:r>
-      <w:r>
-        <w:t xml:space="preserve">idêntico documentado aqui não implica que o controlador de produção (Seção </w:t>
-      </w:r>
-      <w:hyperlink w:anchor="_a9dfe2aaa1b7a692030aac1c105e37c4dd850c5">
-        <w:r>
-          <w:rPr>
-            <w:rStyle w:val="Hyperlink"/>
-          </w:rPr>
-          <w:t xml:space="preserve">2.5</w:t>
-        </w:r>
-      </w:hyperlink>
-      <w:r>
-        <w:t xml:space="preserve">)</w:t>
-      </w:r>
-      <w:r>
-        <w:t xml:space="preserve"> </w:t>
-      </w:r>
-      <w:r>
-        <w:t xml:space="preserve">tenha convergido do mesmo jeito sob nascimentos sorteados e um horizonte de treinamento muito maior.</w:t>
-      </w:r>
-      <w:r>
-        <w:t xml:space="preserve"> </w:t>
-      </w:r>
-      <w:r>
-        <w:t xml:space="preserve">A segunda é a mesma de antes: cada configuração corresponde a uma única execução (não a uma média de</w:t>
-      </w:r>
-      <w:r>
-        <w:t xml:space="preserve"> </w:t>
-      </w:r>
-      <w:r>
-        <w:t xml:space="preserve">sementes independentes), de modo que a coincidência de picos exatamente na geração 222 em onze</w:t>
-      </w:r>
-      <w:r>
-        <w:t xml:space="preserve"> </w:t>
-      </w:r>
-      <w:r>
-        <w:t xml:space="preserve">execuções sem semente fixa compartilhada é, ela própria, um indício de quão determinístico o teto</w:t>
-      </w:r>
-      <w:r>
-        <w:t xml:space="preserve"> </w:t>
-      </w:r>
-      <w:r>
-        <w:t xml:space="preserve">se tornou nesta bateria específica – mas não prova que o mesmo valha fora dela. Repetir esta mesma</w:t>
-      </w:r>
-      <w:r>
-        <w:t xml:space="preserve"> </w:t>
-      </w:r>
-      <w:r>
-        <w:t xml:space="preserve">bateria com cenários aleatórios, em vez dos fixos, é o próximo passo natural para saber se a</w:t>
-      </w:r>
-      <w:r>
-        <w:t xml:space="preserve"> </w:t>
-      </w:r>
-      <w:r>
-        <w:t xml:space="preserve">saturação observada é exclusiva dos cenários táticos obrigatórios ou uma característica mais geral</w:t>
-      </w:r>
-      <w:r>
-        <w:t xml:space="preserve"> </w:t>
-      </w:r>
-      <w:r>
-        <w:t xml:space="preserve">do ambiente endurecido.</w:t>
-      </w:r>
-    </w:p>
-    <w:p>
-      <w:pPr>
-        <w:pStyle w:val="Heading4"/>
-      </w:pPr>
-      <w:bookmarkStart w:id="41" w:name="_6f6ca97711e47e30f12b65921c0a5477e5441d6"/>
-      <w:r>
-        <w:t xml:space="preserve">Teste direto: o teto é da rede ou da duração fixa do episódio?</w:t>
-      </w:r>
-      <w:bookmarkEnd w:id="41"/>
-    </w:p>
-    <w:p>
-      <w:pPr>
-        <w:pStyle w:val="FirstParagraph"/>
-      </w:pPr>
-      <w:r>
-        <w:t xml:space="preserve">Uma forma mais direta de responder a essa pergunta, sem depender dos cenários táticos fixos, é</w:t>
-      </w:r>
-      <w:r>
-        <w:t xml:space="preserve"> </w:t>
-      </w:r>
-      <w:r>
-        <w:t xml:space="preserve">remover a própria causa suspeita: a duração fixa do episódio. Foi adicionado um modo de avaliação</w:t>
-      </w:r>
-      <w:r>
-        <w:t xml:space="preserve"> </w:t>
-      </w:r>
-      <w:r>
-        <w:t xml:space="preserve">(</w:t>
-      </w:r>
-      <w:r>
-        <w:rPr>
-          <w:rStyle w:val="VerbatimChar"/>
-        </w:rPr>
-        <w:t xml:space="preserve">ParametrosTreinamento.SemLimiteDeDuracao</w:t>
-      </w:r>
-      <w:r>
-        <w:t xml:space="preserve">) em que o episódio IGNORA os 45 s normais e só</w:t>
-      </w:r>
-      <w:r>
-        <w:t xml:space="preserve"> </w:t>
-      </w:r>
-      <w:r>
-        <w:t xml:space="preserve">termina quando um alvo de fato rompe uma torre (ou aos 1800 s de uma salvaguarda, nunca atingida nos</w:t>
-      </w:r>
-      <w:r>
-        <w:t xml:space="preserve"> </w:t>
-      </w:r>
-      <w:r>
-        <w:t xml:space="preserve">testes) – a escalada de dificuldade continua usando os 45 s como referência de ritmo, só o corte</w:t>
-      </w:r>
-      <w:r>
-        <w:t xml:space="preserve"> </w:t>
-      </w:r>
-      <w:r>
-        <w:t xml:space="preserve">abrupto por tempo é desligado. O genoma de produção já treinado (pico de fitness 193,57 em</w:t>
-      </w:r>
-      <w:r>
-        <w:t xml:space="preserve"> </w:t>
-      </w:r>
-      <w:r>
-        <w:t xml:space="preserve">treinamento, dentro do limite normal de 45 s) foi avaliado assim em 40 episódios independentes, sem</w:t>
-      </w:r>
-      <w:r>
-        <w:t xml:space="preserve"> </w:t>
-      </w:r>
-      <w:r>
-        <w:t xml:space="preserve">nenhuma mudança na rede. O resultado desfaz a pergunta original em duas partes, não uma resposta</w:t>
-      </w:r>
-      <w:r>
-        <w:t xml:space="preserve"> </w:t>
-      </w:r>
-      <w:r>
-        <w:t xml:space="preserve">única: o fitness MÁXIMO observado sobe para 443,23 – quase o triplo do teto de produção e acima da</w:t>
-      </w:r>
-      <w:r>
-        <w:t xml:space="preserve"> </w:t>
-      </w:r>
-      <w:r>
-        <w:t xml:space="preserve">meta de 300 que motivou este experimento –, confirmando que a duração fixa de fato interrompia</w:t>
-      </w:r>
-      <w:r>
-        <w:t xml:space="preserve"> </w:t>
-      </w:r>
-      <w:r>
-        <w:t xml:space="preserve">episódios que ainda tinham pontuação disponível; mas o fitness MÉDIO (82,35) e a duração média até a</w:t>
-      </w:r>
-      <w:r>
-        <w:t xml:space="preserve"> </w:t>
-      </w:r>
-      <w:r>
-        <w:t xml:space="preserve">invasão de uma torre (29,2 s, variando de 5,4 s a 87,4 s) mostram que boa parte dos episódios termina</w:t>
-      </w:r>
-      <w:r>
-        <w:t xml:space="preserve"> </w:t>
-      </w:r>
-      <w:r>
-        <w:t xml:space="preserve">por falha real do controlador bem ANTES dos 45 s originais, não por causa do corte. Em outras</w:t>
-      </w:r>
-      <w:r>
-        <w:t xml:space="preserve"> </w:t>
-      </w:r>
-      <w:r>
-        <w:t xml:space="preserve">palavras, o teto observado em produção não é puramente "o episódio é curto demais" – é a combinação</w:t>
-      </w:r>
-      <w:r>
-        <w:t xml:space="preserve"> </w:t>
-      </w:r>
-      <w:r>
-        <w:t xml:space="preserve">de um corte de tempo que, de fato, tira pontuação de episódios bem-sucedidos, com uma robustez do</w:t>
-      </w:r>
-      <w:r>
-        <w:t xml:space="preserve"> </w:t>
-      </w:r>
-      <w:r>
-        <w:t xml:space="preserve">controlador ainda insuficiente para evitar falhas precoces numa fração considerável dos cenários.</w:t>
-      </w:r>
-      <w:r>
-        <w:t xml:space="preserve"> </w:t>
-      </w:r>
-      <w:r>
-        <w:t xml:space="preserve">Isso aponta para dois trabalhos futuros distintos, não um só: alongar o horizonte de treinamento</w:t>
-      </w:r>
-      <w:r>
-        <w:t xml:space="preserve"> </w:t>
-      </w:r>
-      <w:r>
-        <w:t xml:space="preserve">(para a rede aprender a explorar episódios longos e bem-sucedidos) e reduzir a variância entre</w:t>
-      </w:r>
-      <w:r>
-        <w:t xml:space="preserve"> </w:t>
-      </w:r>
-      <w:r>
-        <w:rPr>
-          <w:i/>
-          <w:iCs/>
-        </w:rPr>
-        <w:t xml:space="preserve">seeds</w:t>
-      </w:r>
-      <w:r>
-        <w:t xml:space="preserve"> </w:t>
-      </w:r>
-      <w:r>
-        <w:t xml:space="preserve">(o número inteiro que inicializa o gerador de números pseudoaleatórios do episódio</w:t>
-      </w:r>
-      <w:r>
-        <w:t xml:space="preserve"> </w:t>
-      </w:r>
-      <w:r>
-        <w:t xml:space="preserve">– a mesma seed sempre produz exatamente os mesmos alvos, nas mesmas posições e velocidades, byte a</w:t>
-      </w:r>
-      <w:r>
-        <w:t xml:space="preserve"> </w:t>
-      </w:r>
-      <w:r>
-        <w:t xml:space="preserve">byte) (para a rede falhar com menos frequência nos cenários desfavoráveis), sendo este segundo,</w:t>
-      </w:r>
-      <w:r>
-        <w:t xml:space="preserve"> </w:t>
-      </w:r>
-      <w:r>
-        <w:t xml:space="preserve">pelos dados aqui, o fator que mais pesa na média atual.</w:t>
-      </w:r>
-    </w:p>
-    <w:p>
-      <w:pPr>
-        <w:pStyle w:val="Heading4"/>
-      </w:pPr>
-      <w:bookmarkStart w:id="42" w:name="_1bf2000792916e0bed441329e6a871d37499b4e"/>
-      <w:r>
-        <w:t xml:space="preserve">A variância é da rede, do ambiente, ou da avaliação do algoritmo genético?</w:t>
-      </w:r>
-      <w:bookmarkEnd w:id="42"/>
     </w:p>
     <w:p>
       <w:pPr>
@@ -8506,11 +7727,11 @@
       <w:pPr>
         <w:pStyle w:val="Heading4"/>
       </w:pPr>
-      <w:bookmarkStart w:id="43" w:name="_5efa9ab645c173328f5beeebd73b3f00fd0d91c"/>
+      <w:bookmarkStart w:id="40" w:name="_5efa9ab645c173328f5beeebd73b3f00fd0d91c"/>
       <w:r>
         <w:t xml:space="preserve">Confirmação direta: a rede hesita no gatilho.</w:t>
       </w:r>
-      <w:bookmarkEnd w:id="43"/>
+      <w:bookmarkEnd w:id="40"/>
     </w:p>
     <w:p>
       <w:pPr>
@@ -8644,11 +7865,11 @@
       <w:pPr>
         <w:pStyle w:val="Heading4"/>
       </w:pPr>
-      <w:bookmarkStart w:id="44" w:name="_89f8e81ca63b74d94cc35845b4b10db7eb18625"/>
+      <w:bookmarkStart w:id="41" w:name="_89f8e81ca63b74d94cc35845b4b10db7eb18625"/>
       <w:r>
         <w:t xml:space="preserve">Removendo de vez a duração fixa: o teto é, em parte, do ambiente – mas não só dele.</w:t>
       </w:r>
-      <w:bookmarkEnd w:id="44"/>
+      <w:bookmarkEnd w:id="41"/>
     </w:p>
     <w:p>
       <w:pPr>
@@ -8793,11 +8014,11 @@
       <w:pPr>
         <w:pStyle w:val="Heading4"/>
       </w:pPr>
-      <w:bookmarkStart w:id="45" w:name="_fde12c858e31031b99436ab41472e8034d52cbf"/>
+      <w:bookmarkStart w:id="42" w:name="_fde12c858e31031b99436ab41472e8034d52cbf"/>
       <w:r>
         <w:t xml:space="preserve">Corrigindo a função de fitness: penalizar a recusa em si.</w:t>
       </w:r>
-      <w:bookmarkEnd w:id="45"/>
+      <w:bookmarkEnd w:id="42"/>
     </w:p>
     <w:p>
       <w:pPr>
@@ -8953,11 +8174,11 @@
       <w:pPr>
         <w:pStyle w:val="Heading4"/>
       </w:pPr>
-      <w:bookmarkStart w:id="46" w:name="_221b27377f34cd5f22bde52cfe261f5ec8ecada"/>
+      <w:bookmarkStart w:id="43" w:name="_221b27377f34cd5f22bde52cfe261f5ec8ecada"/>
       <w:r>
         <w:t xml:space="preserve">Terceira comparação: a mesma rede, sem a camada heurística, supera as outras duas.</w:t>
       </w:r>
-      <w:bookmarkEnd w:id="46"/>
+      <w:bookmarkEnd w:id="43"/>
     </w:p>
     <w:p>
       <w:pPr>
@@ -9051,7 +8272,7 @@
         <w:t xml:space="preserve">é o melhor dos três regimes medidos nesta seção:</w:t>
       </w:r>
     </w:p>
-    <w:bookmarkStart w:id="47" w:name="_5ceef59c4ab9da767d1a77aed9a18f4ade70e0e"/>
+    <w:bookmarkStart w:id="44" w:name="_5ceef59c4ab9da767d1a77aed9a18f4ade70e0e"/>
     <w:p>
       <w:pPr>
         <w:pStyle w:val="TableCaption"/>
@@ -9307,7 +8528,7 @@
         </w:tc>
       </w:tr>
     </w:tbl>
-    <w:bookmarkEnd w:id="47"/>
+    <w:bookmarkEnd w:id="44"/>
     <w:p>
       <w:pPr>
         <w:pStyle w:val="FirstParagraph"/>
@@ -9403,11 +8624,11 @@
       <w:pPr>
         <w:pStyle w:val="Heading2"/>
       </w:pPr>
-      <w:bookmarkStart w:id="48" w:name="_486fa9899c0f78d34a1f268e0b69fc61eae8b87"/>
+      <w:bookmarkStart w:id="45" w:name="_486fa9899c0f78d34a1f268e0b69fc61eae8b87"/>
       <w:r>
         <w:t xml:space="preserve">Diagrama de pacotes</w:t>
       </w:r>
-      <w:bookmarkEnd w:id="48"/>
+      <w:bookmarkEnd w:id="45"/>
     </w:p>
     <w:p>
       <w:pPr>
@@ -9542,18 +8763,18 @@
           <wp:inline>
             <wp:extent cx="5334000" cy="6402160"/>
             <wp:effectExtent b="0" l="0" r="0" t="0"/>
-            <wp:docPr descr="" title="" id="50" name="Picture"/>
+            <wp:docPr descr="" title="" id="47" name="Picture"/>
             <a:graphic>
               <a:graphicData uri="http://schemas.openxmlformats.org/drawingml/2006/picture">
                 <pic:pic>
                   <pic:nvPicPr>
-                    <pic:cNvPr descr="Diagrama_de_Pacotes.png" id="51" name="Picture"/>
+                    <pic:cNvPr descr="Diagrama_de_Pacotes.png" id="48" name="Picture"/>
                     <pic:cNvPicPr>
                       <a:picLocks noChangeArrowheads="1" noChangeAspect="1"/>
                     </pic:cNvPicPr>
                   </pic:nvPicPr>
                   <pic:blipFill>
-                    <a:blip r:embed="rId49"/>
+                    <a:blip r:embed="rId46"/>
                     <a:stretch>
                       <a:fillRect/>
                     </a:stretch>
@@ -9934,11 +9155,11 @@
       <w:pPr>
         <w:pStyle w:val="Heading2"/>
       </w:pPr>
-      <w:bookmarkStart w:id="52" w:name="_a9dfe2aaa1b7a692030aac1c105e37c4dd850c5"/>
+      <w:bookmarkStart w:id="49" w:name="_a9dfe2aaa1b7a692030aac1c105e37c4dd850c5"/>
       <w:r>
         <w:t xml:space="preserve">Modelo de dados</w:t>
       </w:r>
-      <w:bookmarkEnd w:id="52"/>
+      <w:bookmarkEnd w:id="49"/>
     </w:p>
     <w:p>
       <w:pPr>
@@ -10109,7 +9330,7 @@
         <w:t xml:space="preserve">) entre execuções.</w:t>
       </w:r>
     </w:p>
-    <w:bookmarkStart w:id="53" w:name="_341738a343ac6a3715c393c7b100f1fd2f1f5ab"/>
+    <w:bookmarkStart w:id="50" w:name="_341738a343ac6a3715c393c7b100f1fd2f1f5ab"/>
     <w:p>
       <w:pPr>
         <w:pStyle w:val="TableCaption"/>
@@ -10579,21 +9800,54 @@
         </w:tc>
       </w:tr>
     </w:tbl>
-    <w:bookmarkEnd w:id="53"/>
+    <w:bookmarkEnd w:id="50"/>
     <w:p>
       <w:pPr>
         <w:pStyle w:val="FirstParagraph"/>
       </w:pPr>
       <w:r>
-        <w:t xml:space="preserve">O modelo de dados atual (SQLite, 11 tabelas, chaves estrangeiras reais) é apresentado a seguir em</w:t>
-      </w:r>
-      <w:r>
-        <w:t xml:space="preserve"> </w:t>
-      </w:r>
-      <w:r>
-        <w:t xml:space="preserve">três grupos, por legibilidade: o núcleo de usuários e preferências (Figura </w:t>
-      </w:r>
-      <w:hyperlink w:anchor="_262b76719279ca6c0ff7304adffb50ca4b96150">
+        <w:t xml:space="preserve">O modelo completo (diagramas entidade-relacionamento dos três núcleos – usuários/preferências,</w:t>
+      </w:r>
+      <w:r>
+        <w:t xml:space="preserve"> </w:t>
+      </w:r>
+      <w:r>
+        <w:t xml:space="preserve">detecção/câmeras/auditoria e treinamento neuroevolutivo – e o detalhamento de cada relacionamento</w:t>
+      </w:r>
+      <w:r>
+        <w:t xml:space="preserve"> </w:t>
+      </w:r>
+      <w:r>
+        <w:t xml:space="preserve">por chave estrangeira) está em</w:t>
+      </w:r>
+      <w:r>
+        <w:t xml:space="preserve"> </w:t>
+      </w:r>
+      <w:r>
+        <w:rPr>
+          <w:rStyle w:val="VerbatimChar"/>
+        </w:rPr>
+        <w:t xml:space="preserve">Modelo_Banco_de_Dados.md</w:t>
+      </w:r>
+      <w:r>
+        <w:t xml:space="preserve"> </w:t>
+      </w:r>
+      <w:r>
+        <w:t xml:space="preserve">e na versão técnica</w:t>
+      </w:r>
+      <w:r>
+        <w:t xml:space="preserve"> </w:t>
+      </w:r>
+      <w:r>
+        <w:rPr>
+          <w:rStyle w:val="VerbatimChar"/>
+        </w:rPr>
+        <w:t xml:space="preserve">MODELO_DADOS.md</w:t>
+      </w:r>
+      <w:r>
+        <w:t xml:space="preserve">, ambos levantados diretamente do código-fonte. A Figura </w:t>
+      </w:r>
+      <w:hyperlink w:anchor="_0300f214585135f1e933d93ca28f64310a95f2e">
         <w:r>
           <w:rPr>
             <w:rStyle w:val="Hyperlink"/>
@@ -10602,50 +9856,42 @@
         </w:r>
       </w:hyperlink>
       <w:r>
-        <w:t xml:space="preserve">),</w:t>
-      </w:r>
-      <w:r>
-        <w:t xml:space="preserve"> </w:t>
-      </w:r>
-      <w:r>
-        <w:t xml:space="preserve">o núcleo de detecção, câmeras e auditoria (Figura </w:t>
-      </w:r>
-      <w:hyperlink w:anchor="_0300f214585135f1e933d93ca28f64310a95f2e">
+        <w:t xml:space="preserve"> </w:t>
+      </w:r>
+      <w:r>
+        <w:t xml:space="preserve">ilustra o núcleo de</w:t>
+      </w:r>
+      <w:r>
+        <w:t xml:space="preserve"> </w:t>
+      </w:r>
+      <w:r>
+        <w:t xml:space="preserve">detecção e auditoria, o mais conectado dos três; as quatro tabelas de treinamento (última linha da</w:t>
+      </w:r>
+      <w:r>
+        <w:t xml:space="preserve"> </w:t>
+      </w:r>
+      <w:r>
+        <w:t xml:space="preserve">Tabela </w:t>
+      </w:r>
+      <w:hyperlink w:anchor="_341738a343ac6a3715c393c7b100f1fd2f1f5ab">
         <w:r>
           <w:rPr>
             <w:rStyle w:val="Hyperlink"/>
           </w:rPr>
-          <w:t xml:space="preserve">2</w:t>
+          <w:t xml:space="preserve">5</w:t>
         </w:r>
       </w:hyperlink>
       <w:r>
-        <w:t xml:space="preserve">) e as tabelas de</w:t>
-      </w:r>
-      <w:r>
-        <w:t xml:space="preserve"> </w:t>
-      </w:r>
-      <w:r>
-        <w:t xml:space="preserve">treinamento neuroevolutivo, independentes entre si (Figura </w:t>
-      </w:r>
-      <w:hyperlink w:anchor="_1eaa75570fdfc487fe3144efd4f1a83ef457d14">
-        <w:r>
-          <w:rPr>
-            <w:rStyle w:val="Hyperlink"/>
-          </w:rPr>
-          <w:t xml:space="preserve">3</w:t>
-        </w:r>
-      </w:hyperlink>
-      <w:r>
-        <w:t xml:space="preserve">) – diagramas</w:t>
-      </w:r>
-      <w:r>
-        <w:t xml:space="preserve"> </w:t>
-      </w:r>
-      <w:r>
-        <w:t xml:space="preserve">entidade-relacionamento levantados a partir do código-fonte do projeto.</w:t>
-      </w:r>
-    </w:p>
-    <w:bookmarkStart w:id="57" w:name="_262b76719279ca6c0ff7304adffb50ca4b96150"/>
+        <w:t xml:space="preserve">) não se relacionam por chave estrangeira com as demais nem entre</w:t>
+      </w:r>
+      <w:r>
+        <w:t xml:space="preserve"> </w:t>
+      </w:r>
+      <w:r>
+        <w:t xml:space="preserve">si – são séries temporais independentes, identificadas pelo número da geração.</w:t>
+      </w:r>
+    </w:p>
+    <w:bookmarkStart w:id="54" w:name="_0300f214585135f1e933d93ca28f64310a95f2e"/>
     <w:p>
       <w:pPr>
         <w:pStyle w:val="CaptionedFigure"/>
@@ -10653,119 +9899,20 @@
       <w:r>
         <w:drawing>
           <wp:inline>
-            <wp:extent cx="4533900" cy="4176455"/>
+            <wp:extent cx="5334000" cy="5019872"/>
             <wp:effectExtent b="0" l="0" r="0" t="0"/>
-            <wp:docPr descr="" title="" id="55" name="Picture"/>
+            <wp:docPr descr="" title="" id="52" name="Picture"/>
             <a:graphic>
               <a:graphicData uri="http://schemas.openxmlformats.org/drawingml/2006/picture">
                 <pic:pic>
                   <pic:nvPicPr>
-                    <pic:cNvPr descr="DER_Usuarios_Modo_Preferencias.png" id="56" name="Picture"/>
+                    <pic:cNvPr descr="DER_Cameras_Objetos_Detectados.png" id="53" name="Picture"/>
                     <pic:cNvPicPr>
                       <a:picLocks noChangeArrowheads="1" noChangeAspect="1"/>
                     </pic:cNvPicPr>
                   </pic:nvPicPr>
                   <pic:blipFill>
-                    <a:blip r:embed="rId54"/>
-                    <a:stretch>
-                      <a:fillRect/>
-                    </a:stretch>
-                  </pic:blipFill>
-                  <pic:spPr bwMode="auto">
-                    <a:xfrm>
-                      <a:off x="0" y="0"/>
-                      <a:ext cx="4533900" cy="4176455"/>
-                    </a:xfrm>
-                    <a:prstGeom prst="rect">
-                      <a:avLst/>
-                    </a:prstGeom>
-                    <a:noFill/>
-                    <a:ln w="9525">
-                      <a:noFill/>
-                      <a:headEnd/>
-                      <a:tailEnd/>
-                    </a:ln>
-                  </pic:spPr>
-                </pic:pic>
-              </a:graphicData>
-            </a:graphic>
-          </wp:inline>
-        </w:drawing>
-      </w:r>
-    </w:p>
-    <w:p>
-      <w:pPr>
-        <w:pStyle w:val="ImageCaption"/>
-      </w:pPr>
-      <w:r>
-        <w:t xml:space="preserve">Núcleo de usuários:</w:t>
-      </w:r>
-      <w:r>
-        <w:t xml:space="preserve"> </w:t>
-      </w:r>
-      <w:r>
-        <w:rPr>
-          <w:rStyle w:val="VerbatimChar"/>
-        </w:rPr>
-        <w:t xml:space="preserve">usuarios</w:t>
-      </w:r>
-      <w:r>
-        <w:t xml:space="preserve">,</w:t>
-      </w:r>
-      <w:r>
-        <w:t xml:space="preserve"> </w:t>
-      </w:r>
-      <w:r>
-        <w:rPr>
-          <w:rStyle w:val="VerbatimChar"/>
-        </w:rPr>
-        <w:t xml:space="preserve">modo_atual_torre</w:t>
-      </w:r>
-      <w:r>
-        <w:t xml:space="preserve"> </w:t>
-      </w:r>
-      <w:r>
-        <w:t xml:space="preserve">e</w:t>
-      </w:r>
-      <w:r>
-        <w:t xml:space="preserve"> </w:t>
-      </w:r>
-      <w:r>
-        <w:rPr>
-          <w:rStyle w:val="VerbatimChar"/>
-        </w:rPr>
-        <w:t xml:space="preserve">preferencias_usuario</w:t>
-      </w:r>
-      <w:r>
-        <w:t xml:space="preserve"> </w:t>
-      </w:r>
-      <w:r>
-        <w:t xml:space="preserve">(dos autores).</w:t>
-      </w:r>
-    </w:p>
-    <w:bookmarkEnd w:id="57"/>
-    <w:bookmarkStart w:id="61" w:name="_0300f214585135f1e933d93ca28f64310a95f2e"/>
-    <w:p>
-      <w:pPr>
-        <w:pStyle w:val="CaptionedFigure"/>
-      </w:pPr>
-      <w:r>
-        <w:drawing>
-          <wp:inline>
-            <wp:extent cx="5334000" cy="5019872"/>
-            <wp:effectExtent b="0" l="0" r="0" t="0"/>
-            <wp:docPr descr="" title="" id="59" name="Picture"/>
-            <a:graphic>
-              <a:graphicData uri="http://schemas.openxmlformats.org/drawingml/2006/picture">
-                <pic:pic>
-                  <pic:nvPicPr>
-                    <pic:cNvPr descr="DER_Cameras_Objetos_Detectados.png" id="60" name="Picture"/>
-                    <pic:cNvPicPr>
-                      <a:picLocks noChangeArrowheads="1" noChangeAspect="1"/>
-                    </pic:cNvPicPr>
-                  </pic:nvPicPr>
-                  <pic:blipFill>
-                    <a:blip r:embed="rId58"/>
+                    <a:blip r:embed="rId51"/>
                     <a:stretch>
                       <a:fillRect/>
                     </a:stretch>
@@ -10872,491 +10019,16 @@
         <w:t xml:space="preserve">autores).</w:t>
       </w:r>
     </w:p>
-    <w:bookmarkEnd w:id="61"/>
-    <w:bookmarkStart w:id="65" w:name="_1eaa75570fdfc487fe3144efd4f1a83ef457d14"/>
-    <w:p>
-      <w:pPr>
-        <w:pStyle w:val="CaptionedFigure"/>
-      </w:pPr>
-      <w:r>
-        <w:drawing>
-          <wp:inline>
-            <wp:extent cx="5334000" cy="1746290"/>
-            <wp:effectExtent b="0" l="0" r="0" t="0"/>
-            <wp:docPr descr="" title="" id="63" name="Picture"/>
-            <a:graphic>
-              <a:graphicData uri="http://schemas.openxmlformats.org/drawingml/2006/picture">
-                <pic:pic>
-                  <pic:nvPicPr>
-                    <pic:cNvPr descr="DER_Tabelas_Treinamento.png" id="64" name="Picture"/>
-                    <pic:cNvPicPr>
-                      <a:picLocks noChangeArrowheads="1" noChangeAspect="1"/>
-                    </pic:cNvPicPr>
-                  </pic:nvPicPr>
-                  <pic:blipFill>
-                    <a:blip r:embed="rId62"/>
-                    <a:stretch>
-                      <a:fillRect/>
-                    </a:stretch>
-                  </pic:blipFill>
-                  <pic:spPr bwMode="auto">
-                    <a:xfrm>
-                      <a:off x="0" y="0"/>
-                      <a:ext cx="5334000" cy="1746290"/>
-                    </a:xfrm>
-                    <a:prstGeom prst="rect">
-                      <a:avLst/>
-                    </a:prstGeom>
-                    <a:noFill/>
-                    <a:ln w="9525">
-                      <a:noFill/>
-                      <a:headEnd/>
-                      <a:tailEnd/>
-                    </a:ln>
-                  </pic:spPr>
-                </pic:pic>
-              </a:graphicData>
-            </a:graphic>
-          </wp:inline>
-        </w:drawing>
-      </w:r>
-    </w:p>
-    <w:p>
-      <w:pPr>
-        <w:pStyle w:val="ImageCaption"/>
-      </w:pPr>
-      <w:r>
-        <w:t xml:space="preserve">Tabelas de treinamento neuroevolutivo – séries temporais independentes entre si:</w:t>
-      </w:r>
-      <w:r>
-        <w:t xml:space="preserve"> </w:t>
-      </w:r>
-      <w:r>
-        <w:rPr>
-          <w:rStyle w:val="VerbatimChar"/>
-        </w:rPr>
-        <w:t xml:space="preserve">historico_treinamento_geracoes</w:t>
-      </w:r>
-      <w:r>
-        <w:t xml:space="preserve">,</w:t>
-      </w:r>
-      <w:r>
-        <w:t xml:space="preserve"> </w:t>
-      </w:r>
-      <w:r>
-        <w:rPr>
-          <w:rStyle w:val="VerbatimChar"/>
-        </w:rPr>
-        <w:t xml:space="preserve">marcos_fitness_treinamento</w:t>
-      </w:r>
-      <w:r>
-        <w:t xml:space="preserve"> </w:t>
-      </w:r>
-      <w:r>
-        <w:t xml:space="preserve">e</w:t>
-      </w:r>
-      <w:r>
-        <w:t xml:space="preserve"> </w:t>
-      </w:r>
-      <w:r>
-        <w:rPr>
-          <w:rStyle w:val="VerbatimChar"/>
-        </w:rPr>
-        <w:t xml:space="preserve">instantaneos_comportamento_melhor_gene</w:t>
-      </w:r>
-      <w:r>
-        <w:t xml:space="preserve"> </w:t>
-      </w:r>
-      <w:r>
-        <w:t xml:space="preserve">(dos autores).</w:t>
-      </w:r>
-    </w:p>
-    <w:bookmarkEnd w:id="65"/>
-    <w:p>
-      <w:pPr>
-        <w:pStyle w:val="FirstParagraph"/>
-      </w:pPr>
-      <w:r>
-        <w:rPr>
-          <w:rStyle w:val="VerbatimChar"/>
-        </w:rPr>
-        <w:t xml:space="preserve">usuarios</w:t>
-      </w:r>
-      <w:r>
-        <w:t xml:space="preserve"> </w:t>
-      </w:r>
-      <w:r>
-        <w:t xml:space="preserve">se relaciona 1:1 com</w:t>
-      </w:r>
-      <w:r>
-        <w:t xml:space="preserve"> </w:t>
-      </w:r>
-      <w:r>
-        <w:rPr>
-          <w:rStyle w:val="VerbatimChar"/>
-        </w:rPr>
-        <w:t xml:space="preserve">preferencias_usuario</w:t>
-      </w:r>
-      <w:r>
-        <w:t xml:space="preserve"> </w:t>
-      </w:r>
-      <w:r>
-        <w:t xml:space="preserve">(chave</w:t>
-      </w:r>
-      <w:r>
-        <w:t xml:space="preserve"> </w:t>
-      </w:r>
-      <w:r>
-        <w:rPr>
-          <w:rStyle w:val="VerbatimChar"/>
-        </w:rPr>
-        <w:t xml:space="preserve">UsuarioId</w:t>
-      </w:r>
-      <w:r>
-        <w:t xml:space="preserve"> </w:t>
-      </w:r>
-      <m:oMath>
-        <m:r>
-          <m:rPr>
-            <m:sty m:val="p"/>
-          </m:rPr>
-          <m:t>→</m:t>
-        </m:r>
-      </m:oMath>
-      <w:r>
-        <w:t xml:space="preserve"> </w:t>
-      </w:r>
-      <w:r>
-        <w:rPr>
-          <w:rStyle w:val="VerbatimChar"/>
-        </w:rPr>
-        <w:t xml:space="preserve">usuarios.Id</w:t>
-      </w:r>
-      <w:r>
-        <w:t xml:space="preserve">) e 1:N com</w:t>
-      </w:r>
-      <w:r>
-        <w:t xml:space="preserve"> </w:t>
-      </w:r>
-      <w:r>
-        <w:rPr>
-          <w:rStyle w:val="VerbatimChar"/>
-        </w:rPr>
-        <w:t xml:space="preserve">modo_atual_torre</w:t>
-      </w:r>
-      <w:r>
-        <w:t xml:space="preserve"> </w:t>
-      </w:r>
-      <w:r>
-        <w:t xml:space="preserve">(</w:t>
-      </w:r>
-      <w:r>
-        <w:rPr>
-          <w:rStyle w:val="VerbatimChar"/>
-        </w:rPr>
-        <w:t xml:space="preserve">ID_USER</w:t>
-      </w:r>
-      <w:r>
-        <w:t xml:space="preserve"> </w:t>
-      </w:r>
-      <m:oMath>
-        <m:r>
-          <m:rPr>
-            <m:sty m:val="p"/>
-          </m:rPr>
-          <m:t>→</m:t>
-        </m:r>
-      </m:oMath>
-      <w:r>
-        <w:t xml:space="preserve"> </w:t>
-      </w:r>
-      <w:r>
-        <w:rPr>
-          <w:rStyle w:val="VerbatimChar"/>
-        </w:rPr>
-        <w:t xml:space="preserve">usuarios.Id</w:t>
-      </w:r>
-      <w:r>
-        <w:t xml:space="preserve">) – em ambos os casos por chave estrangeira</w:t>
-      </w:r>
-      <w:r>
-        <w:t xml:space="preserve"> </w:t>
-      </w:r>
-      <w:r>
-        <w:t xml:space="preserve">real de inteiro, não mais por login em texto.</w:t>
-      </w:r>
-      <w:r>
-        <w:t xml:space="preserve"> </w:t>
-      </w:r>
-      <w:r>
-        <w:rPr>
-          <w:rStyle w:val="VerbatimChar"/>
-        </w:rPr>
-        <w:t xml:space="preserve">objetos_detectados</w:t>
-      </w:r>
-      <w:r>
-        <w:t xml:space="preserve"> </w:t>
-      </w:r>
-      <w:r>
-        <w:t xml:space="preserve">se relaciona 1:N com</w:t>
-      </w:r>
-      <w:r>
-        <w:t xml:space="preserve"> </w:t>
-      </w:r>
-      <w:r>
-        <w:rPr>
-          <w:rStyle w:val="VerbatimChar"/>
-        </w:rPr>
-        <w:t xml:space="preserve">acoes_realizadas</w:t>
-      </w:r>
-      <w:r>
-        <w:t xml:space="preserve"> </w:t>
-      </w:r>
-      <w:r>
-        <w:t xml:space="preserve">(quando há alvo associado ao acionamento), com</w:t>
-      </w:r>
-      <w:r>
-        <w:t xml:space="preserve"> </w:t>
-      </w:r>
-      <w:r>
-        <w:rPr>
-          <w:rStyle w:val="VerbatimChar"/>
-        </w:rPr>
-        <w:t xml:space="preserve">ocorrencia_estados</w:t>
-      </w:r>
-      <w:r>
-        <w:t xml:space="preserve"> </w:t>
-      </w:r>
-      <w:r>
-        <w:t xml:space="preserve">(histórico de transição de estado) e com</w:t>
-      </w:r>
-      <w:r>
-        <w:t xml:space="preserve"> </w:t>
-      </w:r>
-      <w:r>
-        <w:rPr>
-          <w:rStyle w:val="VerbatimChar"/>
-        </w:rPr>
-        <w:t xml:space="preserve">classificacoes_alvo</w:t>
-      </w:r>
-      <w:r>
-        <w:t xml:space="preserve"> </w:t>
-      </w:r>
-      <w:r>
-        <w:t xml:space="preserve">(</w:t>
-      </w:r>
-      <w:r>
-        <w:rPr>
-          <w:rStyle w:val="VerbatimChar"/>
-        </w:rPr>
-        <w:t xml:space="preserve">ObjetoDetectadoId</w:t>
-      </w:r>
-      <w:r>
-        <w:t xml:space="preserve"> </w:t>
-      </w:r>
-      <m:oMath>
-        <m:r>
-          <m:rPr>
-            <m:sty m:val="p"/>
-          </m:rPr>
-          <m:t>→</m:t>
-        </m:r>
-      </m:oMath>
-      <w:r>
-        <w:t xml:space="preserve"> </w:t>
-      </w:r>
-      <w:r>
-        <w:rPr>
-          <w:rStyle w:val="VerbatimChar"/>
-        </w:rPr>
-        <w:t xml:space="preserve">objetos_detectados.Id</w:t>
-      </w:r>
-      <w:r>
-        <w:t xml:space="preserve">);</w:t>
-      </w:r>
-      <w:r>
-        <w:t xml:space="preserve"> </w:t>
-      </w:r>
-      <w:r>
-        <w:rPr>
-          <w:rStyle w:val="VerbatimChar"/>
-        </w:rPr>
-        <w:t xml:space="preserve">cameras</w:t>
-      </w:r>
-      <w:r>
-        <w:t xml:space="preserve"> </w:t>
-      </w:r>
-      <w:r>
-        <w:t xml:space="preserve">se relaciona 1:N com</w:t>
-      </w:r>
-      <w:r>
-        <w:t xml:space="preserve"> </w:t>
-      </w:r>
-      <w:r>
-        <w:rPr>
-          <w:rStyle w:val="VerbatimChar"/>
-        </w:rPr>
-        <w:t xml:space="preserve">objetos_detectados</w:t>
-      </w:r>
-      <w:r>
-        <w:t xml:space="preserve"> </w:t>
-      </w:r>
-      <w:r>
-        <w:t xml:space="preserve">pelo quadrante monitorado. As quatro tabelas de treinamento não se relacionam por FK com as demais</w:t>
-      </w:r>
-      <w:r>
-        <w:t xml:space="preserve"> </w:t>
-      </w:r>
-      <w:r>
-        <w:t xml:space="preserve">nem entre si: são séries temporais independentes, cada uma identificada pelo número da geração</w:t>
-      </w:r>
-      <w:r>
-        <w:t xml:space="preserve"> </w:t>
-      </w:r>
-      <w:r>
-        <w:t xml:space="preserve">(</w:t>
-      </w:r>
-      <w:r>
-        <w:rPr>
-          <w:rStyle w:val="VerbatimChar"/>
-        </w:rPr>
-        <w:t xml:space="preserve">GERACAO</w:t>
-      </w:r>
-      <w:r>
-        <w:t xml:space="preserve">/</w:t>
-      </w:r>
-      <w:r>
-        <w:rPr>
-          <w:rStyle w:val="VerbatimChar"/>
-        </w:rPr>
-        <w:t xml:space="preserve">GeracaoMarco</w:t>
-      </w:r>
-      <w:r>
-        <w:t xml:space="preserve">) e pelo instante de registro, cobrindo da granularidade</w:t>
-      </w:r>
-      <w:r>
-        <w:t xml:space="preserve"> </w:t>
-      </w:r>
-      <w:r>
-        <w:t xml:space="preserve">mais fina (</w:t>
-      </w:r>
-      <w:r>
-        <w:rPr>
-          <w:rStyle w:val="VerbatimChar"/>
-        </w:rPr>
-        <w:t xml:space="preserve">historico_treinamento_geracoes</w:t>
-      </w:r>
-      <w:r>
-        <w:t xml:space="preserve">, uma linha por geração) à mais agregada</w:t>
-      </w:r>
-      <w:r>
-        <w:t xml:space="preserve"> </w:t>
-      </w:r>
-      <w:r>
-        <w:t xml:space="preserve">(</w:t>
-      </w:r>
-      <w:r>
-        <w:rPr>
-          <w:rStyle w:val="VerbatimChar"/>
-        </w:rPr>
-        <w:t xml:space="preserve">instantaneos_comportamento_melhor_gene</w:t>
-      </w:r>
-      <w:r>
-        <w:t xml:space="preserve">, uma linha por marco, com o genoma completo em</w:t>
-      </w:r>
-      <w:r>
-        <w:t xml:space="preserve"> </w:t>
-      </w:r>
-      <w:r>
-        <w:t xml:space="preserve">JSON).</w:t>
-      </w:r>
-    </w:p>
-    <w:p>
-      <w:pPr>
-        <w:pStyle w:val="BodyText"/>
-      </w:pPr>
-      <w:r>
-        <w:t xml:space="preserve">Como registro histórico do projeto, o modelo original em arquivos CSV tinha seis entidades (sem</w:t>
-      </w:r>
-      <w:r>
-        <w:t xml:space="preserve"> </w:t>
-      </w:r>
-      <w:r>
-        <w:rPr>
-          <w:rStyle w:val="VerbatimChar"/>
-        </w:rPr>
-        <w:t xml:space="preserve">ChamadoAjuda</w:t>
-      </w:r>
-      <w:r>
-        <w:t xml:space="preserve">, removida do código) e nenhuma chave estrangeira real – os vínculos entre</w:t>
-      </w:r>
-      <w:r>
-        <w:t xml:space="preserve"> </w:t>
-      </w:r>
-      <w:r>
-        <w:rPr>
-          <w:rStyle w:val="VerbatimChar"/>
-        </w:rPr>
-        <w:t xml:space="preserve">Usuario</w:t>
-      </w:r>
-      <w:r>
-        <w:t xml:space="preserve"> </w:t>
-      </w:r>
-      <w:r>
-        <w:t xml:space="preserve">e</w:t>
-      </w:r>
-      <w:r>
-        <w:t xml:space="preserve"> </w:t>
-      </w:r>
-      <w:r>
-        <w:rPr>
-          <w:rStyle w:val="VerbatimChar"/>
-        </w:rPr>
-        <w:t xml:space="preserve">AcaoRealizada</w:t>
-      </w:r>
-      <w:r>
-        <w:t xml:space="preserve">/</w:t>
-      </w:r>
-      <w:r>
-        <w:rPr>
-          <w:rStyle w:val="VerbatimChar"/>
-        </w:rPr>
-        <w:t xml:space="preserve">ModoAtualTorre</w:t>
-      </w:r>
-      <w:r>
-        <w:t xml:space="preserve"> </w:t>
-      </w:r>
-      <w:r>
-        <w:t xml:space="preserve">eram feitos por login em texto. A</w:t>
-      </w:r>
-      <w:r>
-        <w:t xml:space="preserve"> </w:t>
-      </w:r>
-      <w:r>
-        <w:t xml:space="preserve">migração efetivamente realizada seguiu a proposta elaborada a partir desse modelo original para as</w:t>
-      </w:r>
-      <w:r>
-        <w:t xml:space="preserve"> </w:t>
-      </w:r>
-      <w:r>
-        <w:t xml:space="preserve">sete entidades que já existiam, mas foi além dela ao acrescentar as quatro tabelas de treinamento</w:t>
-      </w:r>
-      <w:r>
-        <w:t xml:space="preserve"> </w:t>
-      </w:r>
-      <w:r>
-        <w:t xml:space="preserve">neuroevolutivo, inexistentes na época em que a proposta foi desenhada.</w:t>
-      </w:r>
-    </w:p>
+    <w:bookmarkEnd w:id="54"/>
     <w:p>
       <w:pPr>
         <w:pStyle w:val="Heading1"/>
       </w:pPr>
-      <w:bookmarkStart w:id="66" w:name="_conclusão"/>
+      <w:bookmarkStart w:id="55" w:name="_conclusão"/>
       <w:r>
         <w:t xml:space="preserve">Conclusão</w:t>
       </w:r>
-      <w:bookmarkEnd w:id="66"/>
+      <w:bookmarkEnd w:id="55"/>
     </w:p>
     <w:p>
       <w:pPr>
@@ -11546,8 +10218,8 @@
         <w:t xml:space="preserve">resultados de .</w:t>
       </w:r>
     </w:p>
-    <w:bookmarkStart w:id="75" w:name="_refs"/>
-    <w:bookmarkStart w:id="68" w:name="_017a962bbba5e4ba83c93745e576eb309d6f797"/>
+    <w:bookmarkStart w:id="64" w:name="_refs"/>
+    <w:bookmarkStart w:id="57" w:name="_017a962bbba5e4ba83c93745e576eb309d6f797"/>
     <w:p>
       <w:pPr>
         <w:pStyle w:val="Bibliography"/>
@@ -11572,7 +10244,7 @@
       <w:r>
         <w:t xml:space="preserve"> </w:t>
       </w:r>
-      <w:hyperlink r:id="rId67">
+      <w:hyperlink r:id="rId56">
         <w:r>
           <w:rPr>
             <w:rStyle w:val="Hyperlink"/>
@@ -11584,8 +10256,8 @@
         <w:t xml:space="preserve">.</w:t>
       </w:r>
     </w:p>
-    <w:bookmarkEnd w:id="68"/>
-    <w:bookmarkStart w:id="70" w:name="_a87cabb3e917760088615513f0bf876ba1185a1"/>
+    <w:bookmarkEnd w:id="57"/>
+    <w:bookmarkStart w:id="59" w:name="_a87cabb3e917760088615513f0bf876ba1185a1"/>
     <w:p>
       <w:pPr>
         <w:pStyle w:val="Bibliography"/>
@@ -11619,7 +10291,7 @@
       <w:r>
         <w:t xml:space="preserve"> </w:t>
       </w:r>
-      <w:hyperlink r:id="rId69">
+      <w:hyperlink r:id="rId58">
         <w:r>
           <w:rPr>
             <w:rStyle w:val="Hyperlink"/>
@@ -11631,8 +10303,8 @@
         <w:t xml:space="preserve">.</w:t>
       </w:r>
     </w:p>
-    <w:bookmarkEnd w:id="70"/>
-    <w:bookmarkStart w:id="72" w:name="_958467714e5f88c1dc8113ffde245624df1a09c"/>
+    <w:bookmarkEnd w:id="59"/>
+    <w:bookmarkStart w:id="61" w:name="_958467714e5f88c1dc8113ffde245624df1a09c"/>
     <w:p>
       <w:pPr>
         <w:pStyle w:val="Bibliography"/>
@@ -11657,7 +10329,7 @@
       <w:r>
         <w:t xml:space="preserve"> </w:t>
       </w:r>
-      <w:hyperlink r:id="rId71">
+      <w:hyperlink r:id="rId60">
         <w:r>
           <w:rPr>
             <w:rStyle w:val="Hyperlink"/>
@@ -11669,8 +10341,8 @@
         <w:t xml:space="preserve">.</w:t>
       </w:r>
     </w:p>
-    <w:bookmarkEnd w:id="72"/>
-    <w:bookmarkStart w:id="74" w:name="_f017af51ad974aa4fd21aaf257ad1c283aff8cb"/>
+    <w:bookmarkEnd w:id="61"/>
+    <w:bookmarkStart w:id="63" w:name="_f017af51ad974aa4fd21aaf257ad1c283aff8cb"/>
     <w:p>
       <w:pPr>
         <w:pStyle w:val="Bibliography"/>
@@ -11695,7 +10367,7 @@
       <w:r>
         <w:t xml:space="preserve"> </w:t>
       </w:r>
-      <w:hyperlink r:id="rId73">
+      <w:hyperlink r:id="rId62">
         <w:r>
           <w:rPr>
             <w:rStyle w:val="Hyperlink"/>
@@ -11707,8 +10379,8 @@
         <w:t xml:space="preserve">.</w:t>
       </w:r>
     </w:p>
-    <w:bookmarkEnd w:id="74"/>
-    <w:bookmarkEnd w:id="75"/>
+    <w:bookmarkEnd w:id="63"/>
+    <w:bookmarkEnd w:id="64"/>
     <w:sectPr>
       <w:footnotePr>
         <w:numRestart w:val="eachSect"/>
@@ -12061,6 +10733,36 @@
     </w:lvlOverride>
   </w:num>
   <w:num w:numId="1003">
+    <w:abstractNumId w:val="99201"/>
+    <w:lvlOverride w:ilvl="0">
+      <w:startOverride w:val="1"/>
+    </w:lvlOverride>
+    <w:lvlOverride w:ilvl="1">
+      <w:startOverride w:val="1"/>
+    </w:lvlOverride>
+    <w:lvlOverride w:ilvl="2">
+      <w:startOverride w:val="1"/>
+    </w:lvlOverride>
+    <w:lvlOverride w:ilvl="3">
+      <w:startOverride w:val="1"/>
+    </w:lvlOverride>
+    <w:lvlOverride w:ilvl="4">
+      <w:startOverride w:val="1"/>
+    </w:lvlOverride>
+    <w:lvlOverride w:ilvl="5">
+      <w:startOverride w:val="1"/>
+    </w:lvlOverride>
+    <w:lvlOverride w:ilvl="6">
+      <w:startOverride w:val="1"/>
+    </w:lvlOverride>
+    <w:lvlOverride w:ilvl="7">
+      <w:startOverride w:val="1"/>
+    </w:lvlOverride>
+    <w:lvlOverride w:ilvl="8">
+      <w:startOverride w:val="1"/>
+    </w:lvlOverride>
+  </w:num>
+  <w:num w:numId="1004">
     <w:abstractNumId w:val="99201"/>
     <w:lvlOverride w:ilvl="0">
       <w:startOverride w:val="1"/>

</xml_diff>